<commit_message>
docs: critic brief and critic report on the method, the app and the build process; Master Template edits
Co-Authored-By: Claude Fable 5.1 <noreply@anthropic.com>
</commit_message>
<xml_diff>
--- a/Brain/Master Template.docx
+++ b/Brain/Master Template.docx
@@ -617,7 +617,21 @@
         <w:rPr>
           <w:highlight w:val="cyan"/>
         </w:rPr>
-        <w:t>All points under the scope are written per available control information. In no case this is a mandatory point list. In real jobs these points will change per that specific jobs available control information</w:t>
+        <w:t xml:space="preserve">All points under the scope are written per available control information. In no case this is a mandatory point list. In real jobs these points will change per </w:t>
+      </w:r>
+      <w:proofErr w:type="gramStart"/>
+      <w:r>
+        <w:rPr>
+          <w:highlight w:val="cyan"/>
+        </w:rPr>
+        <w:t>that specific jobs</w:t>
+      </w:r>
+      <w:proofErr w:type="gramEnd"/>
+      <w:r>
+        <w:rPr>
+          <w:highlight w:val="cyan"/>
+        </w:rPr>
+        <w:t xml:space="preserve"> available control information</w:t>
       </w:r>
     </w:p>
     <w:p>
@@ -735,6 +749,7 @@
       </w:r>
     </w:p>
     <w:p>
+      <w:proofErr w:type="gramStart"/>
       <w:r>
         <w:t>→</w:t>
       </w:r>
@@ -742,7 +757,14 @@
         <w:rPr>
           <w:color w:val="ED7D31" w:themeColor="accent2"/>
         </w:rPr>
-        <w:t>(these are additional insights for you, do not print them in scope of work)</w:t>
+        <w:t>(</w:t>
+      </w:r>
+      <w:proofErr w:type="gramEnd"/>
+      <w:r>
+        <w:rPr>
+          <w:color w:val="ED7D31" w:themeColor="accent2"/>
+        </w:rPr>
+        <w:t>these are additional insights for you, do not print them in scope of work)</w:t>
       </w:r>
     </w:p>
     <w:p>
@@ -1256,7 +1278,7 @@
           <w:sz w:val="24"/>
           <w:szCs w:val="24"/>
         </w:rPr>
-        <w:t>Default</w:t>
+        <w:t>Standard if BMS is there</w:t>
       </w:r>
     </w:p>
     <w:p>
@@ -1299,6 +1321,7 @@
         <w:rPr>
           <w:rFonts w:ascii="Myriad Pro" w:eastAsia="Myriad Pro" w:hAnsi="Myriad Pro" w:cs="Calibri"/>
           <w:b/>
+          <w:color w:val="ED7D31" w:themeColor="accent2"/>
           <w:sz w:val="24"/>
           <w:szCs w:val="24"/>
         </w:rPr>
@@ -1311,7 +1334,7 @@
           <w:sz w:val="24"/>
           <w:szCs w:val="24"/>
         </w:rPr>
-        <w:t xml:space="preserve">Default </w:t>
+        <w:t>Standard if BMS is there</w:t>
       </w:r>
     </w:p>
     <w:p>
@@ -1545,15 +1568,24 @@
           <w:rFonts w:cstheme="minorHAnsi"/>
           <w:color w:val="000000"/>
         </w:rPr>
-        <w:t xml:space="preserve">Extension of Existing </w:t>
-      </w:r>
+        <w:t xml:space="preserve">Extension of </w:t>
+      </w:r>
+      <w:proofErr w:type="gramStart"/>
       <w:r>
         <w:rPr>
           <w:rFonts w:cstheme="minorHAnsi"/>
           <w:color w:val="000000"/>
         </w:rPr>
+        <w:t xml:space="preserve">Existing </w:t>
+      </w:r>
+      <w:r>
+        <w:rPr>
+          <w:rFonts w:cstheme="minorHAnsi"/>
+          <w:color w:val="000000"/>
+        </w:rPr>
         <w:t>:</w:t>
       </w:r>
+      <w:proofErr w:type="gramEnd"/>
     </w:p>
     <w:p>
       <w:pPr>
@@ -1753,7 +1785,7 @@
         <w:rPr>
           <w:rFonts w:ascii="Myriad Pro" w:eastAsia="Myriad Pro" w:hAnsi="Myriad Pro" w:cs="Calibri"/>
           <w:b/>
-          <w:color w:val="FF0000"/>
+          <w:color w:val="000000" w:themeColor="text1"/>
           <w:sz w:val="24"/>
           <w:szCs w:val="24"/>
         </w:rPr>
@@ -1800,8 +1832,8 @@
       <w:pPr>
         <w:widowControl w:val="0"/>
         <w:numPr>
-          <w:ilvl w:val="1"/>
-          <w:numId w:val="4"/>
+          <w:ilvl w:val="2"/>
+          <w:numId w:val="3"/>
         </w:numPr>
         <w:autoSpaceDE w:val="0"/>
         <w:autoSpaceDN w:val="0"/>
@@ -1809,6 +1841,7 @@
         <w:rPr>
           <w:rFonts w:ascii="Myriad Pro" w:eastAsia="Myriad Pro" w:hAnsi="Myriad Pro" w:cs="Calibri"/>
           <w:b/>
+          <w:color w:val="ED7D31" w:themeColor="accent2"/>
           <w:sz w:val="24"/>
           <w:szCs w:val="24"/>
         </w:rPr>
@@ -1820,7 +1853,26 @@
           <w:sz w:val="24"/>
           <w:szCs w:val="24"/>
         </w:rPr>
-        <w:t xml:space="preserve">Furnish 3-D Graphics to match existing       </w:t>
+        <w:t xml:space="preserve">Furnish 3-D Graphics to match existing    </w:t>
+      </w:r>
+      <w:r>
+        <w:rPr>
+          <w:rFonts w:ascii="Myriad Pro" w:eastAsia="Myriad Pro" w:hAnsi="Myriad Pro" w:cs="Calibri"/>
+          <w:b/>
+          <w:sz w:val="24"/>
+          <w:szCs w:val="24"/>
+        </w:rPr>
+        <w:br/>
+      </w:r>
+      <w:r>
+        <w:rPr>
+          <w:rFonts w:ascii="Myriad Pro" w:eastAsia="Myriad Pro" w:hAnsi="Myriad Pro" w:cs="Calibri"/>
+          <w:b/>
+          <w:color w:val="ED7D31" w:themeColor="accent2"/>
+          <w:sz w:val="24"/>
+          <w:szCs w:val="24"/>
+        </w:rPr>
+        <w:t>Standard if BMS is there</w:t>
       </w:r>
     </w:p>
     <w:p>
@@ -1847,7 +1899,36 @@
           <w:sz w:val="24"/>
           <w:szCs w:val="24"/>
         </w:rPr>
-        <w:t>Furnish Necessary Training on New Controls</w:t>
+        <w:t xml:space="preserve">   Furnish Necessary Training on New Controls</w:t>
+      </w:r>
+    </w:p>
+    <w:p>
+      <w:pPr>
+        <w:widowControl w:val="0"/>
+        <w:numPr>
+          <w:ilvl w:val="2"/>
+          <w:numId w:val="4"/>
+        </w:numPr>
+        <w:autoSpaceDE w:val="0"/>
+        <w:autoSpaceDN w:val="0"/>
+        <w:spacing w:after="0" w:line="240" w:lineRule="auto"/>
+        <w:rPr>
+          <w:rFonts w:ascii="Myriad Pro" w:eastAsia="Myriad Pro" w:hAnsi="Myriad Pro" w:cs="Calibri"/>
+          <w:b/>
+          <w:color w:val="ED7D31" w:themeColor="accent2"/>
+          <w:sz w:val="24"/>
+          <w:szCs w:val="24"/>
+        </w:rPr>
+      </w:pPr>
+      <w:r>
+        <w:rPr>
+          <w:rFonts w:ascii="Myriad Pro" w:eastAsia="Myriad Pro" w:hAnsi="Myriad Pro" w:cs="Calibri"/>
+          <w:b/>
+          <w:color w:val="ED7D31" w:themeColor="accent2"/>
+          <w:sz w:val="24"/>
+          <w:szCs w:val="24"/>
+        </w:rPr>
+        <w:t>Standard if BMS is there</w:t>
       </w:r>
     </w:p>
     <w:p>
@@ -2047,6 +2128,7 @@
         <w:spacing w:after="0"/>
       </w:pPr>
       <w:r>
+        <w:lastRenderedPageBreak/>
         <w:t xml:space="preserve">Demo and safe-off existing control wiring prior to relocation of unit </w:t>
       </w:r>
     </w:p>
@@ -2079,7 +2161,6 @@
         <w:spacing w:after="0"/>
       </w:pPr>
       <w:r>
-        <w:lastRenderedPageBreak/>
         <w:t xml:space="preserve">Furnish and Install Damper Actuator </w:t>
       </w:r>
     </w:p>
@@ -2544,7 +2625,21 @@
         <w:rPr>
           <w:b/>
         </w:rPr>
-        <w:t>Nest Thermostat ( Alternate) check schedule for notes)</w:t>
+        <w:t xml:space="preserve">Nest Thermostat </w:t>
+      </w:r>
+      <w:proofErr w:type="gramStart"/>
+      <w:r>
+        <w:rPr>
+          <w:b/>
+        </w:rPr>
+        <w:t>( Alternate</w:t>
+      </w:r>
+      <w:proofErr w:type="gramEnd"/>
+      <w:r>
+        <w:rPr>
+          <w:b/>
+        </w:rPr>
+        <w:t>) check schedule for notes)</w:t>
       </w:r>
     </w:p>
     <w:p>
@@ -2884,6 +2979,7 @@
           <w:b/>
           <w:color w:val="ED7D31" w:themeColor="accent2"/>
         </w:rPr>
+        <w:lastRenderedPageBreak/>
         <w:t>(</w:t>
       </w:r>
       <w:proofErr w:type="spellStart"/>
@@ -3141,6 +3237,20 @@
       <w:r>
         <w:t xml:space="preserve">Furnish DDC Controller to the Factory for Installation </w:t>
       </w:r>
+      <w:r>
+        <w:rPr>
+          <w:b/>
+          <w:bCs/>
+        </w:rPr>
+        <w:t>– Mandatory for VAV</w:t>
+      </w:r>
+      <w:r>
+        <w:rPr>
+          <w:b/>
+          <w:bCs/>
+        </w:rPr>
+        <w:t>s</w:t>
+      </w:r>
     </w:p>
     <w:p>
       <w:pPr>
@@ -3307,7 +3417,21 @@
         <w:rPr>
           <w:color w:val="ED7D31" w:themeColor="accent2"/>
         </w:rPr>
-        <w:t xml:space="preserve">mandatory when we have reheat VAV; meaning there is heating coil mentioned in the schedule </w:t>
+        <w:t xml:space="preserve">mandatory when we have </w:t>
+      </w:r>
+      <w:proofErr w:type="gramStart"/>
+      <w:r>
+        <w:rPr>
+          <w:color w:val="ED7D31" w:themeColor="accent2"/>
+        </w:rPr>
+        <w:t>reheat</w:t>
+      </w:r>
+      <w:proofErr w:type="gramEnd"/>
+      <w:r>
+        <w:rPr>
+          <w:color w:val="ED7D31" w:themeColor="accent2"/>
+        </w:rPr>
+        <w:t xml:space="preserve"> VAV; meaning there is heating coil mentioned in the schedule </w:t>
       </w:r>
     </w:p>
     <w:p>
@@ -3438,7 +3562,33 @@
         <w:rPr>
           <w:b/>
         </w:rPr>
-        <w:t>Run 24V Power Loop to VAVs (Mentioned 24 V Wiring Control by BMS Contractor)</w:t>
+        <w:t>Run 24V Power Loop to VAVs (Mentioned 24 V Wiring Control by BMS Contractor</w:t>
+      </w:r>
+      <w:r>
+        <w:rPr>
+          <w:b/>
+        </w:rPr>
+        <w:t xml:space="preserve"> in specs / controls diagram, sequence </w:t>
+      </w:r>
+      <w:proofErr w:type="spellStart"/>
+      <w:r>
+        <w:rPr>
+          <w:b/>
+        </w:rPr>
+        <w:t>etc</w:t>
+      </w:r>
+      <w:proofErr w:type="spellEnd"/>
+      <w:r>
+        <w:rPr>
+          <w:b/>
+        </w:rPr>
+        <w:t>,</w:t>
+      </w:r>
+      <w:r>
+        <w:rPr>
+          <w:b/>
+        </w:rPr>
+        <w:t>)</w:t>
       </w:r>
     </w:p>
     <w:p>
@@ -3672,6 +3822,7 @@
           <w:b/>
           <w:color w:val="ED7D31" w:themeColor="accent2"/>
         </w:rPr>
+        <w:lastRenderedPageBreak/>
         <w:t>**Reheat VAV – Hot water; we include hot water control valve and actuator. Look for GPM in VAV schedule</w:t>
       </w:r>
     </w:p>
@@ -3736,7 +3887,6 @@
           <w:b/>
           <w:color w:val="ED7D31" w:themeColor="accent2"/>
         </w:rPr>
-        <w:lastRenderedPageBreak/>
         <w:t>**tech hour: 4 hour each for each hot water reheat VAV</w:t>
       </w:r>
     </w:p>
@@ -4114,19 +4264,38 @@
         </w:numPr>
         <w:spacing w:after="0"/>
         <w:ind w:left="1800"/>
+      </w:pPr>
+      <w:r>
         <w:rPr>
           <w:b/>
           <w:bCs/>
           <w:color w:val="ED7D31" w:themeColor="accent2"/>
         </w:rPr>
-      </w:pPr>
+        <w:t>**When sequence mentions Exhaust fan operation shall be interlocked with Associated unit, we can use something like this</w:t>
+      </w:r>
       <w:r>
         <w:rPr>
           <w:b/>
           <w:bCs/>
           <w:color w:val="ED7D31" w:themeColor="accent2"/>
         </w:rPr>
-        <w:t>**When sequence mentions Exhaust fan operation shall be interlocked with Associated unit, we can use something like this,</w:t>
+        <w:t xml:space="preserve"> and if </w:t>
+      </w:r>
+      <w:r>
+        <w:rPr>
+          <w:b/>
+          <w:bCs/>
+          <w:color w:val="7030A0"/>
+        </w:rPr>
+        <w:t>AHU / RTU /MAU</w:t>
+      </w:r>
+      <w:r>
+        <w:rPr>
+          <w:b/>
+          <w:bCs/>
+          <w:color w:val="7030A0"/>
+        </w:rPr>
+        <w:t xml:space="preserve"> controls are packaged </w:t>
       </w:r>
     </w:p>
     <w:p>
@@ -4136,7 +4305,14 @@
           <w:ilvl w:val="0"/>
           <w:numId w:val="0"/>
         </w:numPr>
-        <w:spacing w:after="0"/>
+        <w:tabs>
+          <w:tab w:val="left" w:pos="864"/>
+        </w:tabs>
+        <w:spacing w:after="0"/>
+        <w:ind w:left="1440"/>
+        <w:rPr>
+          <w:b/>
+        </w:rPr>
       </w:pPr>
     </w:p>
     <w:p>
@@ -4155,6 +4331,12 @@
           <w:b/>
         </w:rPr>
       </w:pPr>
+      <w:r>
+        <w:rPr>
+          <w:b/>
+        </w:rPr>
+        <w:t>Gas Detection Panel (Garage/ Parking / Loading Dock system) Stand Alone Operation</w:t>
+      </w:r>
     </w:p>
     <w:p>
       <w:pPr>
@@ -4172,11 +4354,166 @@
           <w:b/>
         </w:rPr>
       </w:pPr>
-      <w:r>
-        <w:rPr>
-          <w:b/>
-        </w:rPr>
-        <w:t>Gas Detection Panel (Garage/ Parking / Loading Dock system) Stand Alone Operation</w:t>
+    </w:p>
+    <w:p>
+      <w:pPr>
+        <w:pStyle w:val="PR2"/>
+        <w:tabs>
+          <w:tab w:val="num" w:pos="1440"/>
+        </w:tabs>
+        <w:spacing w:after="0"/>
+        <w:rPr>
+          <w:b/>
+          <w:sz w:val="24"/>
+        </w:rPr>
+      </w:pPr>
+      <w:r>
+        <w:rPr>
+          <w:b/>
+          <w:sz w:val="24"/>
+        </w:rPr>
+        <w:t>Qty (</w:t>
+      </w:r>
+      <w:r>
+        <w:rPr>
+          <w:b/>
+          <w:sz w:val="24"/>
+        </w:rPr>
+        <w:t>#</w:t>
+      </w:r>
+      <w:r>
+        <w:rPr>
+          <w:b/>
+          <w:sz w:val="24"/>
+        </w:rPr>
+        <w:t xml:space="preserve">) Gas Detection Panel </w:t>
+      </w:r>
+    </w:p>
+    <w:p>
+      <w:pPr>
+        <w:pStyle w:val="PR2"/>
+        <w:tabs>
+          <w:tab w:val="num" w:pos="1440"/>
+        </w:tabs>
+        <w:spacing w:after="0"/>
+        <w:rPr>
+          <w:b/>
+          <w:sz w:val="24"/>
+        </w:rPr>
+      </w:pPr>
+      <w:r>
+        <w:rPr>
+          <w:b/>
+          <w:sz w:val="24"/>
+        </w:rPr>
+        <w:t>Qty (#) Exhaust Fan</w:t>
+      </w:r>
+    </w:p>
+    <w:p>
+      <w:pPr>
+        <w:pStyle w:val="PR2"/>
+        <w:tabs>
+          <w:tab w:val="num" w:pos="1440"/>
+        </w:tabs>
+        <w:spacing w:after="0"/>
+        <w:rPr>
+          <w:b/>
+          <w:sz w:val="24"/>
+        </w:rPr>
+      </w:pPr>
+      <w:r>
+        <w:rPr>
+          <w:b/>
+          <w:sz w:val="24"/>
+        </w:rPr>
+        <w:t xml:space="preserve">Qty (#) Supply Fan </w:t>
+      </w:r>
+    </w:p>
+    <w:p>
+      <w:pPr>
+        <w:pStyle w:val="PR2"/>
+        <w:numPr>
+          <w:ilvl w:val="4"/>
+          <w:numId w:val="6"/>
+        </w:numPr>
+        <w:spacing w:after="0"/>
+      </w:pPr>
+      <w:r>
+        <w:t xml:space="preserve">Furnish and Install </w:t>
+      </w:r>
+      <w:r>
+        <w:t>Gas Detection Panel (Qty. ##)</w:t>
+      </w:r>
+    </w:p>
+    <w:p>
+      <w:pPr>
+        <w:pStyle w:val="PR2"/>
+        <w:numPr>
+          <w:ilvl w:val="5"/>
+          <w:numId w:val="6"/>
+        </w:numPr>
+        <w:spacing w:after="0"/>
+      </w:pPr>
+      <w:r>
+        <w:t>CO/NO2 Sensor (Qty. ##)</w:t>
+      </w:r>
+    </w:p>
+    <w:p>
+      <w:pPr>
+        <w:pStyle w:val="PR2"/>
+        <w:numPr>
+          <w:ilvl w:val="5"/>
+          <w:numId w:val="6"/>
+        </w:numPr>
+        <w:spacing w:after="0"/>
+      </w:pPr>
+      <w:r>
+        <w:t>Remote Horn / Strobe Sensor</w:t>
+      </w:r>
+      <w:r>
+        <w:t xml:space="preserve"> (Qty. ##)</w:t>
+      </w:r>
+    </w:p>
+    <w:p>
+      <w:pPr>
+        <w:pStyle w:val="PR2"/>
+        <w:numPr>
+          <w:ilvl w:val="4"/>
+          <w:numId w:val="6"/>
+        </w:numPr>
+        <w:spacing w:after="0"/>
+      </w:pPr>
+      <w:r>
+        <w:t>Interlock Fan Operation with Gas Detection Panel</w:t>
+      </w:r>
+    </w:p>
+    <w:p>
+      <w:pPr>
+        <w:pStyle w:val="PR2"/>
+        <w:numPr>
+          <w:ilvl w:val="4"/>
+          <w:numId w:val="6"/>
+        </w:numPr>
+        <w:spacing w:after="0"/>
+      </w:pPr>
+      <w:r>
+        <w:t xml:space="preserve">Furnish and Install Damper Actuator </w:t>
+      </w:r>
+      <w:r>
+        <w:t xml:space="preserve"> </w:t>
+      </w:r>
+    </w:p>
+    <w:p>
+      <w:pPr>
+        <w:pStyle w:val="PR2"/>
+        <w:numPr>
+          <w:ilvl w:val="4"/>
+          <w:numId w:val="6"/>
+        </w:numPr>
+        <w:spacing w:after="0"/>
+      </w:pPr>
+      <w:r>
+        <w:t>Tie into BMS</w:t>
       </w:r>
     </w:p>
     <w:p>
@@ -4193,193 +4530,31 @@
         <w:ind w:left="1440"/>
         <w:rPr>
           <w:b/>
-        </w:rPr>
-      </w:pPr>
-    </w:p>
-    <w:p>
-      <w:pPr>
-        <w:pStyle w:val="PR2"/>
-        <w:tabs>
-          <w:tab w:val="num" w:pos="1440"/>
-        </w:tabs>
-        <w:spacing w:after="0"/>
-        <w:rPr>
-          <w:b/>
-          <w:sz w:val="24"/>
-        </w:rPr>
-      </w:pPr>
-      <w:r>
-        <w:rPr>
-          <w:b/>
-          <w:sz w:val="24"/>
-        </w:rPr>
-        <w:t>Qty (</w:t>
-      </w:r>
-      <w:r>
-        <w:rPr>
-          <w:b/>
-          <w:sz w:val="24"/>
-        </w:rPr>
-        <w:t>#</w:t>
-      </w:r>
-      <w:r>
-        <w:rPr>
-          <w:b/>
-          <w:sz w:val="24"/>
-        </w:rPr>
-        <w:t xml:space="preserve">) Gas Detection Panel </w:t>
-      </w:r>
-    </w:p>
-    <w:p>
-      <w:pPr>
-        <w:pStyle w:val="PR2"/>
-        <w:tabs>
-          <w:tab w:val="num" w:pos="1440"/>
-        </w:tabs>
-        <w:spacing w:after="0"/>
-        <w:rPr>
-          <w:b/>
-          <w:sz w:val="24"/>
-        </w:rPr>
-      </w:pPr>
-      <w:r>
-        <w:rPr>
-          <w:b/>
-          <w:sz w:val="24"/>
-        </w:rPr>
-        <w:t>Qty (#) Exhaust Fan</w:t>
-      </w:r>
-    </w:p>
-    <w:p>
-      <w:pPr>
-        <w:pStyle w:val="PR2"/>
-        <w:tabs>
-          <w:tab w:val="num" w:pos="1440"/>
-        </w:tabs>
-        <w:spacing w:after="0"/>
-        <w:rPr>
-          <w:b/>
-          <w:sz w:val="24"/>
-        </w:rPr>
-      </w:pPr>
-      <w:r>
-        <w:rPr>
-          <w:b/>
-          <w:sz w:val="24"/>
-        </w:rPr>
-        <w:t xml:space="preserve">Qty (#) Supply Fan </w:t>
-      </w:r>
-    </w:p>
-    <w:p>
-      <w:pPr>
-        <w:pStyle w:val="PR2"/>
-        <w:numPr>
-          <w:ilvl w:val="4"/>
-          <w:numId w:val="6"/>
-        </w:numPr>
-        <w:spacing w:after="0"/>
-      </w:pPr>
-      <w:r>
-        <w:t xml:space="preserve">Furnish and Install </w:t>
-      </w:r>
-      <w:r>
-        <w:t>Gas Detection Panel (Qty. ##)</w:t>
-      </w:r>
-    </w:p>
-    <w:p>
-      <w:pPr>
-        <w:pStyle w:val="PR2"/>
-        <w:numPr>
-          <w:ilvl w:val="5"/>
-          <w:numId w:val="6"/>
-        </w:numPr>
-        <w:spacing w:after="0"/>
-      </w:pPr>
-      <w:r>
-        <w:t>CO/NO2 Sensor (Qty. ##)</w:t>
-      </w:r>
-    </w:p>
-    <w:p>
-      <w:pPr>
-        <w:pStyle w:val="PR2"/>
-        <w:numPr>
-          <w:ilvl w:val="5"/>
-          <w:numId w:val="6"/>
-        </w:numPr>
-        <w:spacing w:after="0"/>
-      </w:pPr>
-      <w:r>
-        <w:t>Remote Horn / Strobe Sensor</w:t>
-      </w:r>
-      <w:r>
-        <w:t xml:space="preserve"> (Qty. ##)</w:t>
-      </w:r>
-    </w:p>
-    <w:p>
-      <w:pPr>
-        <w:pStyle w:val="PR2"/>
-        <w:numPr>
-          <w:ilvl w:val="4"/>
-          <w:numId w:val="6"/>
-        </w:numPr>
-        <w:spacing w:after="0"/>
-      </w:pPr>
-      <w:r>
-        <w:t>Interlock Fan Operation with Gas Detection Panel</w:t>
-      </w:r>
-    </w:p>
-    <w:p>
-      <w:pPr>
-        <w:pStyle w:val="PR2"/>
-        <w:numPr>
-          <w:ilvl w:val="4"/>
-          <w:numId w:val="6"/>
-        </w:numPr>
-        <w:spacing w:after="0"/>
-      </w:pPr>
-      <w:r>
-        <w:t xml:space="preserve">Furnish and Install Damper Actuator </w:t>
-      </w:r>
-      <w:r>
-        <w:t xml:space="preserve"> </w:t>
-      </w:r>
-    </w:p>
-    <w:p>
-      <w:pPr>
-        <w:pStyle w:val="PR2"/>
-        <w:numPr>
-          <w:ilvl w:val="4"/>
-          <w:numId w:val="6"/>
-        </w:numPr>
-        <w:spacing w:after="0"/>
-      </w:pPr>
-      <w:r>
-        <w:t>Tie into BMS</w:t>
-      </w:r>
-    </w:p>
-    <w:p>
-      <w:pPr>
-        <w:pStyle w:val="PR2"/>
-        <w:numPr>
-          <w:ilvl w:val="0"/>
-          <w:numId w:val="0"/>
-        </w:numPr>
-        <w:tabs>
-          <w:tab w:val="left" w:pos="864"/>
-        </w:tabs>
-        <w:spacing w:after="0"/>
-        <w:ind w:left="1440"/>
-        <w:rPr>
-          <w:b/>
-          <w:color w:val="ED7D31" w:themeColor="accent2"/>
-        </w:rPr>
-      </w:pPr>
-      <w:r>
-        <w:rPr>
-          <w:b/>
-          <w:color w:val="ED7D31" w:themeColor="accent2"/>
-        </w:rPr>
-        <w:t>**Gas Detection panel is the most important and expensive system, cant miss panel and sensor qty.</w:t>
+          <w:color w:val="ED7D31" w:themeColor="accent2"/>
+        </w:rPr>
+      </w:pPr>
+      <w:r>
+        <w:rPr>
+          <w:b/>
+          <w:color w:val="ED7D31" w:themeColor="accent2"/>
+        </w:rPr>
+        <w:t xml:space="preserve">**Gas Detection panel is the most important and expensive system, </w:t>
+      </w:r>
+      <w:proofErr w:type="gramStart"/>
+      <w:r>
+        <w:rPr>
+          <w:b/>
+          <w:color w:val="ED7D31" w:themeColor="accent2"/>
+        </w:rPr>
+        <w:t>cant</w:t>
+      </w:r>
+      <w:proofErr w:type="gramEnd"/>
+      <w:r>
+        <w:rPr>
+          <w:b/>
+          <w:color w:val="ED7D31" w:themeColor="accent2"/>
+        </w:rPr>
+        <w:t xml:space="preserve"> miss panel and sensor qty.</w:t>
       </w:r>
       <w:r>
         <w:rPr>
@@ -4437,6 +4612,7 @@
           <w:b/>
           <w:color w:val="ED7D31" w:themeColor="accent2"/>
         </w:rPr>
+        <w:lastRenderedPageBreak/>
         <w:t>**Gas detection type: H2 Hydrogen (Battery room, UPS Room)</w:t>
       </w:r>
     </w:p>
@@ -4512,7 +4688,6 @@
           <w:b/>
           <w:color w:val="ED7D31" w:themeColor="accent2"/>
         </w:rPr>
-        <w:lastRenderedPageBreak/>
         <w:t>**Gas detection type: refrigeration (at chillers)</w:t>
       </w:r>
     </w:p>
@@ -4638,7 +4813,19 @@
         <w:spacing w:after="0"/>
       </w:pPr>
       <w:r>
-        <w:t xml:space="preserve">Furnish and Install Timeclock </w:t>
+        <w:t>Furnish and Install Timeclock</w:t>
+      </w:r>
+      <w:r>
+        <w:rPr>
+          <w:color w:val="EE0000"/>
+        </w:rPr>
+        <w:t xml:space="preserve"> </w:t>
+      </w:r>
+      <w:r>
+        <w:rPr>
+          <w:color w:val="EE0000"/>
+        </w:rPr>
+        <w:t>(if Sequence or Schedule note calls it)</w:t>
       </w:r>
     </w:p>
     <w:p>
@@ -4731,6 +4918,32 @@
           <w:color w:val="ED7D31" w:themeColor="accent2"/>
         </w:rPr>
         <w:t xml:space="preserve"> system</w:t>
+      </w:r>
+      <w:r>
+        <w:rPr>
+          <w:b/>
+          <w:bCs/>
+          <w:color w:val="ED7D31" w:themeColor="accent2"/>
+        </w:rPr>
+        <w:t xml:space="preserve">, also if schedule say </w:t>
+      </w:r>
+      <w:proofErr w:type="gramStart"/>
+      <w:r>
+        <w:rPr>
+          <w:b/>
+          <w:bCs/>
+          <w:color w:val="ED7D31" w:themeColor="accent2"/>
+        </w:rPr>
+        <w:t>timeclock</w:t>
+      </w:r>
+      <w:proofErr w:type="gramEnd"/>
+      <w:r>
+        <w:rPr>
+          <w:b/>
+          <w:bCs/>
+          <w:color w:val="ED7D31" w:themeColor="accent2"/>
+        </w:rPr>
+        <w:t xml:space="preserve"> then it is by AME </w:t>
       </w:r>
     </w:p>
     <w:p>
@@ -5273,7 +5486,6 @@
         <w:rPr>
           <w:rStyle w:val="ui-provider"/>
         </w:rPr>
-        <w:lastRenderedPageBreak/>
         <w:t>Interlock wiring to Differential Pressure Controller (Furnished by Unit Mfr.)</w:t>
       </w:r>
     </w:p>
@@ -5676,7 +5888,35 @@
         <w:rPr>
           <w:color w:val="ED7D31" w:themeColor="accent2"/>
         </w:rPr>
-        <w:t xml:space="preserve">*schedule notes and sequence often clears who is providing the controls </w:t>
+        <w:t>*</w:t>
+      </w:r>
+      <w:proofErr w:type="gramStart"/>
+      <w:r>
+        <w:rPr>
+          <w:color w:val="ED7D31" w:themeColor="accent2"/>
+        </w:rPr>
+        <w:t>schedule</w:t>
+      </w:r>
+      <w:proofErr w:type="gramEnd"/>
+      <w:r>
+        <w:rPr>
+          <w:color w:val="ED7D31" w:themeColor="accent2"/>
+        </w:rPr>
+        <w:t xml:space="preserve"> notes and sequence often </w:t>
+      </w:r>
+      <w:proofErr w:type="gramStart"/>
+      <w:r>
+        <w:rPr>
+          <w:color w:val="ED7D31" w:themeColor="accent2"/>
+        </w:rPr>
+        <w:t>clears</w:t>
+      </w:r>
+      <w:proofErr w:type="gramEnd"/>
+      <w:r>
+        <w:rPr>
+          <w:color w:val="ED7D31" w:themeColor="accent2"/>
+        </w:rPr>
+        <w:t xml:space="preserve"> who is providing the controls </w:t>
       </w:r>
       <w:r>
         <w:rPr>
@@ -5828,6 +6068,7 @@
         <w:spacing w:after="0"/>
       </w:pPr>
       <w:r>
+        <w:lastRenderedPageBreak/>
         <w:t xml:space="preserve">Furnish and Install Leak Sensor </w:t>
       </w:r>
     </w:p>
@@ -5866,7 +6107,21 @@
           <w:b/>
           <w:color w:val="ED7D31" w:themeColor="accent2"/>
         </w:rPr>
-        <w:t xml:space="preserve">**tech hour: 4 hour per </w:t>
+        <w:t xml:space="preserve">**tech hour: 4 </w:t>
+      </w:r>
+      <w:r>
+        <w:rPr>
+          <w:b/>
+          <w:color w:val="ED7D31" w:themeColor="accent2"/>
+        </w:rPr>
+        <w:t>hours</w:t>
+      </w:r>
+      <w:r>
+        <w:rPr>
+          <w:b/>
+          <w:color w:val="ED7D31" w:themeColor="accent2"/>
+        </w:rPr>
+        <w:t xml:space="preserve"> per </w:t>
       </w:r>
       <w:proofErr w:type="spellStart"/>
       <w:r>
@@ -5999,6 +6254,19 @@
         <w:spacing w:after="0"/>
       </w:pPr>
       <w:r>
+        <w:t>Furnish DDC Controller to the Factory for Installation (If Schedule / sequence / controls schematic / specs mention about it)</w:t>
+      </w:r>
+    </w:p>
+    <w:p>
+      <w:pPr>
+        <w:pStyle w:val="PR2"/>
+        <w:numPr>
+          <w:ilvl w:val="4"/>
+          <w:numId w:val="6"/>
+        </w:numPr>
+        <w:spacing w:after="0"/>
+      </w:pPr>
+      <w:r>
         <w:t xml:space="preserve">Furnish and Install Supply Static Pressure Sensor </w:t>
       </w:r>
     </w:p>
@@ -6399,6 +6667,7 @@
         <w:spacing w:after="0"/>
       </w:pPr>
       <w:r>
+        <w:lastRenderedPageBreak/>
         <w:t xml:space="preserve">Furnish and Install Outside Air Damper Actuator </w:t>
       </w:r>
     </w:p>
@@ -6477,617 +6746,665 @@
         <w:spacing w:after="0"/>
       </w:pPr>
       <w:r>
+        <w:t xml:space="preserve">Furnish and Wire Cooling Coil Water Control Valve and Actuator </w:t>
+      </w:r>
+    </w:p>
+    <w:p>
+      <w:pPr>
+        <w:pStyle w:val="PR2"/>
+        <w:numPr>
+          <w:ilvl w:val="4"/>
+          <w:numId w:val="6"/>
+        </w:numPr>
+        <w:spacing w:after="0"/>
+      </w:pPr>
+      <w:r>
+        <w:t>Furnish DX Cooling Enable / Disable</w:t>
+      </w:r>
+    </w:p>
+    <w:p>
+      <w:pPr>
+        <w:pStyle w:val="PR2"/>
+        <w:numPr>
+          <w:ilvl w:val="4"/>
+          <w:numId w:val="6"/>
+        </w:numPr>
+        <w:spacing w:after="0"/>
+      </w:pPr>
+      <w:r>
+        <w:t>Furnish Humidifier Enable / Disable</w:t>
+      </w:r>
+    </w:p>
+    <w:p>
+      <w:pPr>
+        <w:pStyle w:val="PR2"/>
+        <w:numPr>
+          <w:ilvl w:val="4"/>
+          <w:numId w:val="6"/>
+        </w:numPr>
+        <w:spacing w:after="0"/>
+      </w:pPr>
+      <w:r>
+        <w:t xml:space="preserve">Furnish Humidifier Control Valve and Actuator </w:t>
+      </w:r>
+    </w:p>
+    <w:p>
+      <w:pPr>
+        <w:pStyle w:val="PR2"/>
+        <w:numPr>
+          <w:ilvl w:val="4"/>
+          <w:numId w:val="6"/>
+        </w:numPr>
+        <w:spacing w:after="0"/>
+      </w:pPr>
+      <w:r>
+        <w:t>Furnish and Install High Limit Humidity Switch</w:t>
+      </w:r>
+    </w:p>
+    <w:p>
+      <w:pPr>
+        <w:pStyle w:val="PR2"/>
+        <w:numPr>
+          <w:ilvl w:val="4"/>
+          <w:numId w:val="6"/>
+        </w:numPr>
+        <w:spacing w:after="0"/>
+      </w:pPr>
+      <w:r>
+        <w:t>Furnish and Install Leak Sensor</w:t>
+      </w:r>
+    </w:p>
+    <w:p>
+      <w:pPr>
+        <w:pStyle w:val="PR2"/>
+        <w:numPr>
+          <w:ilvl w:val="0"/>
+          <w:numId w:val="0"/>
+        </w:numPr>
+        <w:spacing w:after="0"/>
+        <w:ind w:left="1800"/>
+        <w:rPr>
+          <w:b/>
+          <w:bCs/>
+        </w:rPr>
+      </w:pPr>
+      <w:r>
+        <w:rPr>
+          <w:b/>
+          <w:bCs/>
+          <w:color w:val="ED7D31" w:themeColor="accent2"/>
+        </w:rPr>
+        <w:t>(**tech hour: 2 hour each hardware point)</w:t>
+      </w:r>
+    </w:p>
+    <w:p>
+      <w:pPr>
+        <w:pStyle w:val="PR2"/>
+        <w:numPr>
+          <w:ilvl w:val="0"/>
+          <w:numId w:val="0"/>
+        </w:numPr>
+        <w:tabs>
+          <w:tab w:val="left" w:pos="864"/>
+        </w:tabs>
+        <w:spacing w:after="0"/>
+        <w:ind w:left="1440"/>
+        <w:rPr>
+          <w:b/>
+        </w:rPr>
+      </w:pPr>
+    </w:p>
+    <w:p>
+      <w:pPr>
+        <w:pStyle w:val="PR2"/>
+        <w:tabs>
+          <w:tab w:val="num" w:pos="1440"/>
+        </w:tabs>
+        <w:spacing w:after="0"/>
+        <w:rPr>
+          <w:b/>
+          <w:sz w:val="24"/>
+          <w:highlight w:val="green"/>
+        </w:rPr>
+      </w:pPr>
+      <w:r>
+        <w:rPr>
+          <w:b/>
+          <w:sz w:val="24"/>
+          <w:highlight w:val="green"/>
+        </w:rPr>
+        <w:t xml:space="preserve">Qty (1) </w:t>
+      </w:r>
+      <w:r>
+        <w:rPr>
+          <w:b/>
+          <w:sz w:val="24"/>
+          <w:highlight w:val="green"/>
+        </w:rPr>
+        <w:t>Heat Exchanger System</w:t>
+      </w:r>
+      <w:r>
+        <w:rPr>
+          <w:b/>
+          <w:sz w:val="24"/>
+          <w:highlight w:val="green"/>
+        </w:rPr>
+        <w:t xml:space="preserve"> HX-2 | HWP-1, 2</w:t>
+      </w:r>
+    </w:p>
+    <w:p>
+      <w:pPr>
+        <w:pStyle w:val="PR2"/>
+        <w:numPr>
+          <w:ilvl w:val="4"/>
+          <w:numId w:val="6"/>
+        </w:numPr>
+        <w:spacing w:after="0"/>
+      </w:pPr>
+      <w:r>
+        <w:t xml:space="preserve">Furnish and Install DDC Controller </w:t>
+      </w:r>
+    </w:p>
+    <w:p>
+      <w:pPr>
+        <w:pStyle w:val="PR2"/>
+        <w:numPr>
+          <w:ilvl w:val="4"/>
+          <w:numId w:val="6"/>
+        </w:numPr>
+        <w:spacing w:after="0"/>
+      </w:pPr>
+      <w:r>
+        <w:t>Furnish and Install Outside Air Temperature / Humidity Sensor</w:t>
+      </w:r>
+    </w:p>
+    <w:p>
+      <w:pPr>
+        <w:pStyle w:val="PR2"/>
+        <w:numPr>
+          <w:ilvl w:val="4"/>
+          <w:numId w:val="6"/>
+        </w:numPr>
+        <w:spacing w:after="0"/>
+      </w:pPr>
+      <w:r>
+        <w:t xml:space="preserve">Furnish and Install System </w:t>
+      </w:r>
+      <w:r>
+        <w:t>###</w:t>
+      </w:r>
+      <w:r>
+        <w:t xml:space="preserve"> Water Supply / Return Temperature Sensor</w:t>
+      </w:r>
+    </w:p>
+    <w:p>
+      <w:pPr>
+        <w:pStyle w:val="PR2"/>
+        <w:numPr>
+          <w:ilvl w:val="4"/>
+          <w:numId w:val="6"/>
+        </w:numPr>
+        <w:spacing w:after="0"/>
+      </w:pPr>
+      <w:r>
+        <w:t xml:space="preserve">Furnish and Install Building </w:t>
+      </w:r>
+      <w:r>
+        <w:t>###</w:t>
+      </w:r>
+      <w:r>
+        <w:t xml:space="preserve"> Water Supply / Return Temperature Sensor</w:t>
+      </w:r>
+    </w:p>
+    <w:p>
+      <w:pPr>
+        <w:pStyle w:val="PR2"/>
+        <w:numPr>
+          <w:ilvl w:val="4"/>
+          <w:numId w:val="6"/>
+        </w:numPr>
+        <w:spacing w:after="0"/>
+      </w:pPr>
+      <w:r>
+        <w:t xml:space="preserve">Furnish and Install HX </w:t>
+      </w:r>
+      <w:r>
+        <w:t xml:space="preserve">Supply /Return </w:t>
+      </w:r>
+      <w:r>
+        <w:t>Water Temperature Sensor</w:t>
+      </w:r>
+    </w:p>
+    <w:p>
+      <w:pPr>
+        <w:pStyle w:val="PR2"/>
+        <w:numPr>
+          <w:ilvl w:val="4"/>
+          <w:numId w:val="6"/>
+        </w:numPr>
+        <w:spacing w:after="0"/>
+      </w:pPr>
+      <w:r>
+        <w:t>Furnish Pump Start/ Stop and Status</w:t>
+      </w:r>
+    </w:p>
+    <w:p>
+      <w:pPr>
+        <w:pStyle w:val="PR2"/>
+        <w:numPr>
+          <w:ilvl w:val="4"/>
+          <w:numId w:val="6"/>
+        </w:numPr>
+        <w:spacing w:after="0"/>
+      </w:pPr>
+      <w:r>
+        <w:t>Furnish Pump VFD Control</w:t>
+      </w:r>
+    </w:p>
+    <w:p>
+      <w:pPr>
+        <w:pStyle w:val="PR2"/>
+        <w:numPr>
+          <w:ilvl w:val="4"/>
+          <w:numId w:val="6"/>
+        </w:numPr>
+        <w:spacing w:after="0"/>
+      </w:pPr>
+      <w:r>
+        <w:t>Furnish and Install Differential Pressure Transmitter</w:t>
+      </w:r>
+    </w:p>
+    <w:p>
+      <w:pPr>
+        <w:pStyle w:val="PR2"/>
+        <w:numPr>
+          <w:ilvl w:val="4"/>
+          <w:numId w:val="6"/>
+        </w:numPr>
+        <w:spacing w:after="0"/>
+      </w:pPr>
+      <w:r>
+        <w:t>Furnish and Install Hot Water Flow Meter</w:t>
+      </w:r>
+    </w:p>
+    <w:p>
+      <w:pPr>
+        <w:pStyle w:val="PR2"/>
+        <w:numPr>
+          <w:ilvl w:val="4"/>
+          <w:numId w:val="6"/>
+        </w:numPr>
+        <w:spacing w:after="0"/>
+      </w:pPr>
+      <w:r>
+        <w:t>Furnish and Install Steam Flow Meter</w:t>
+      </w:r>
+    </w:p>
+    <w:p>
+      <w:pPr>
+        <w:pStyle w:val="PR2"/>
+        <w:numPr>
+          <w:ilvl w:val="4"/>
+          <w:numId w:val="6"/>
+        </w:numPr>
+        <w:spacing w:after="0"/>
+      </w:pPr>
+      <w:r>
+        <w:t xml:space="preserve">Furnish and Install BTU Meter – Flow Meter, Supply / Return Temperature Sensor </w:t>
+      </w:r>
+    </w:p>
+    <w:p>
+      <w:pPr>
+        <w:pStyle w:val="PR2"/>
+        <w:numPr>
+          <w:ilvl w:val="4"/>
+          <w:numId w:val="6"/>
+        </w:numPr>
+        <w:spacing w:after="0"/>
+      </w:pPr>
+      <w:r>
+        <w:t xml:space="preserve">Furnish and </w:t>
+      </w:r>
+      <w:proofErr w:type="gramStart"/>
+      <w:r>
+        <w:t>Wire</w:t>
+      </w:r>
+      <w:proofErr w:type="gramEnd"/>
+      <w:r>
+        <w:t xml:space="preserve"> ##” HX Steam Control Valve and Actuator</w:t>
+      </w:r>
+      <w:r>
+        <w:t xml:space="preserve"> (1/3</w:t>
+      </w:r>
+      <w:r>
+        <w:rPr>
+          <w:vertAlign w:val="superscript"/>
+        </w:rPr>
+        <w:t>rd</w:t>
+      </w:r>
+      <w:r>
+        <w:t>-2/3</w:t>
+      </w:r>
+      <w:r>
+        <w:rPr>
+          <w:vertAlign w:val="superscript"/>
+        </w:rPr>
+        <w:t>rd</w:t>
+      </w:r>
+      <w:r>
+        <w:t>)</w:t>
+      </w:r>
+    </w:p>
+    <w:p>
+      <w:pPr>
+        <w:pStyle w:val="PR2"/>
+        <w:numPr>
+          <w:ilvl w:val="4"/>
+          <w:numId w:val="6"/>
+        </w:numPr>
+        <w:spacing w:after="0"/>
+      </w:pPr>
+      <w:r>
+        <w:t xml:space="preserve">Furnish and </w:t>
+      </w:r>
+      <w:proofErr w:type="gramStart"/>
+      <w:r>
+        <w:t>Wire</w:t>
+      </w:r>
+      <w:proofErr w:type="gramEnd"/>
+      <w:r>
+        <w:t xml:space="preserve"> ##” HX </w:t>
+      </w:r>
+      <w:r>
+        <w:t xml:space="preserve">Primary Control </w:t>
+      </w:r>
+      <w:r>
+        <w:t>Valve and Actuator</w:t>
+      </w:r>
+    </w:p>
+    <w:p>
+      <w:pPr>
+        <w:pStyle w:val="PR2"/>
+        <w:numPr>
+          <w:ilvl w:val="4"/>
+          <w:numId w:val="6"/>
+        </w:numPr>
+        <w:spacing w:after="0"/>
+      </w:pPr>
+      <w:r>
+        <w:t xml:space="preserve">Furnish and </w:t>
+      </w:r>
+      <w:proofErr w:type="gramStart"/>
+      <w:r>
+        <w:t>Wire</w:t>
+      </w:r>
+      <w:proofErr w:type="gramEnd"/>
+      <w:r>
+        <w:t xml:space="preserve"> ##” HX </w:t>
+      </w:r>
+      <w:r>
+        <w:t xml:space="preserve">Secondary Control </w:t>
+      </w:r>
+      <w:r>
+        <w:t>Valve and Actuator</w:t>
+      </w:r>
+    </w:p>
+    <w:p>
+      <w:pPr>
+        <w:pStyle w:val="PR2"/>
+        <w:numPr>
+          <w:ilvl w:val="4"/>
+          <w:numId w:val="6"/>
+        </w:numPr>
+        <w:spacing w:after="0"/>
+      </w:pPr>
+      <w:r>
+        <w:t xml:space="preserve">Furnish and </w:t>
+      </w:r>
+      <w:proofErr w:type="gramStart"/>
+      <w:r>
+        <w:t>Wire</w:t>
+      </w:r>
+      <w:proofErr w:type="gramEnd"/>
+      <w:r>
+        <w:t xml:space="preserve"> ##” Differential Pressure Bypass Control Valve and Actuator</w:t>
+      </w:r>
+    </w:p>
+    <w:p>
+      <w:pPr>
+        <w:pStyle w:val="PR2"/>
+        <w:numPr>
+          <w:ilvl w:val="0"/>
+          <w:numId w:val="0"/>
+        </w:numPr>
+        <w:tabs>
+          <w:tab w:val="left" w:pos="864"/>
+        </w:tabs>
+        <w:spacing w:after="0"/>
+        <w:ind w:left="1440"/>
+        <w:rPr>
+          <w:b/>
+        </w:rPr>
+      </w:pPr>
+      <w:r>
+        <w:rPr>
+          <w:b/>
+          <w:bCs/>
+          <w:color w:val="ED7D31" w:themeColor="accent2"/>
+        </w:rPr>
+        <w:t>(**tech hour: 2 hour each hardware point)</w:t>
+      </w:r>
+    </w:p>
+    <w:p>
+      <w:pPr>
+        <w:pStyle w:val="PR2"/>
+        <w:tabs>
+          <w:tab w:val="num" w:pos="1440"/>
+        </w:tabs>
+        <w:spacing w:after="0"/>
+        <w:rPr>
+          <w:b/>
+          <w:sz w:val="24"/>
+        </w:rPr>
+      </w:pPr>
+      <w:r>
+        <w:rPr>
+          <w:b/>
+          <w:sz w:val="24"/>
+        </w:rPr>
+        <w:t xml:space="preserve">Qty (1) Heat Exchanger System HX-1 | </w:t>
+      </w:r>
+      <w:r>
+        <w:rPr>
+          <w:b/>
+          <w:sz w:val="24"/>
+        </w:rPr>
+        <w:t>Pump</w:t>
+      </w:r>
+      <w:r>
+        <w:rPr>
+          <w:b/>
+          <w:sz w:val="24"/>
+        </w:rPr>
+        <w:t>-1, 2</w:t>
+      </w:r>
+    </w:p>
+    <w:p>
+      <w:pPr>
+        <w:pStyle w:val="PR2"/>
+        <w:numPr>
+          <w:ilvl w:val="4"/>
+          <w:numId w:val="6"/>
+        </w:numPr>
+        <w:spacing w:after="0"/>
+      </w:pPr>
+      <w:r>
+        <w:t xml:space="preserve">Furnish and Install DDC Controller </w:t>
+      </w:r>
+    </w:p>
+    <w:p>
+      <w:pPr>
+        <w:pStyle w:val="PR2"/>
+        <w:numPr>
+          <w:ilvl w:val="4"/>
+          <w:numId w:val="6"/>
+        </w:numPr>
+        <w:spacing w:after="0"/>
+      </w:pPr>
+      <w:r>
+        <w:t xml:space="preserve">Furnish and Install System </w:t>
+      </w:r>
+      <w:r>
+        <w:t>###</w:t>
+      </w:r>
+      <w:r>
+        <w:t xml:space="preserve"> Water Supply / Return Temperature Sensor</w:t>
+      </w:r>
+    </w:p>
+    <w:p>
+      <w:pPr>
+        <w:pStyle w:val="PR2"/>
+        <w:numPr>
+          <w:ilvl w:val="4"/>
+          <w:numId w:val="6"/>
+        </w:numPr>
+        <w:spacing w:after="0"/>
+      </w:pPr>
+      <w:r>
+        <w:t xml:space="preserve">Furnish and Install Building </w:t>
+      </w:r>
+      <w:r>
+        <w:t>###</w:t>
+      </w:r>
+      <w:r>
+        <w:t xml:space="preserve"> Water Supply / Return Temperature Sensor</w:t>
+      </w:r>
+    </w:p>
+    <w:p>
+      <w:pPr>
+        <w:pStyle w:val="PR2"/>
+        <w:numPr>
+          <w:ilvl w:val="4"/>
+          <w:numId w:val="6"/>
+        </w:numPr>
+        <w:spacing w:after="0"/>
+      </w:pPr>
+      <w:r>
+        <w:t xml:space="preserve">Furnish and Install HX </w:t>
+      </w:r>
+      <w:r>
+        <w:t xml:space="preserve">Supply /Return </w:t>
+      </w:r>
+      <w:r>
+        <w:t>Water Temperature Sensor</w:t>
+      </w:r>
+    </w:p>
+    <w:p>
+      <w:pPr>
+        <w:pStyle w:val="PR2"/>
+        <w:numPr>
+          <w:ilvl w:val="4"/>
+          <w:numId w:val="6"/>
+        </w:numPr>
+        <w:spacing w:after="0"/>
+      </w:pPr>
+      <w:r>
+        <w:t>Furnish Pump Start/ Stop and Status</w:t>
+      </w:r>
+    </w:p>
+    <w:p>
+      <w:pPr>
+        <w:pStyle w:val="PR2"/>
+        <w:numPr>
+          <w:ilvl w:val="4"/>
+          <w:numId w:val="6"/>
+        </w:numPr>
+        <w:spacing w:after="0"/>
+      </w:pPr>
+      <w:r>
+        <w:t>Furnish Pump VFD Control</w:t>
+      </w:r>
+    </w:p>
+    <w:p>
+      <w:pPr>
+        <w:pStyle w:val="PR2"/>
+        <w:numPr>
+          <w:ilvl w:val="4"/>
+          <w:numId w:val="6"/>
+        </w:numPr>
+        <w:spacing w:after="0"/>
+      </w:pPr>
+      <w:r>
+        <w:t>Furnish and Install Differential Pressure Transmitter</w:t>
+      </w:r>
+    </w:p>
+    <w:p>
+      <w:pPr>
+        <w:pStyle w:val="PR2"/>
+        <w:numPr>
+          <w:ilvl w:val="4"/>
+          <w:numId w:val="6"/>
+        </w:numPr>
+        <w:spacing w:after="0"/>
+      </w:pPr>
+      <w:r>
+        <w:t>Furnish and Install Chilled Water Flow Meter</w:t>
+      </w:r>
+    </w:p>
+    <w:p>
+      <w:pPr>
+        <w:pStyle w:val="PR2"/>
+        <w:numPr>
+          <w:ilvl w:val="4"/>
+          <w:numId w:val="6"/>
+        </w:numPr>
+        <w:spacing w:after="0"/>
+      </w:pPr>
+      <w:r>
+        <w:t>Furnish and Install Steam Flow Meter</w:t>
+      </w:r>
+    </w:p>
+    <w:p>
+      <w:pPr>
+        <w:pStyle w:val="PR2"/>
+        <w:numPr>
+          <w:ilvl w:val="4"/>
+          <w:numId w:val="6"/>
+        </w:numPr>
+        <w:spacing w:after="0"/>
+      </w:pPr>
+      <w:r>
         <w:lastRenderedPageBreak/>
-        <w:t xml:space="preserve">Furnish and Wire Cooling Coil Water Control Valve and Actuator </w:t>
-      </w:r>
-    </w:p>
-    <w:p>
-      <w:pPr>
-        <w:pStyle w:val="PR2"/>
-        <w:numPr>
-          <w:ilvl w:val="4"/>
-          <w:numId w:val="6"/>
-        </w:numPr>
-        <w:spacing w:after="0"/>
-      </w:pPr>
-      <w:r>
-        <w:t>Furnish DX Cooling Enable / Disable</w:t>
-      </w:r>
-    </w:p>
-    <w:p>
-      <w:pPr>
-        <w:pStyle w:val="PR2"/>
-        <w:numPr>
-          <w:ilvl w:val="4"/>
-          <w:numId w:val="6"/>
-        </w:numPr>
-        <w:spacing w:after="0"/>
-      </w:pPr>
-      <w:r>
-        <w:t>Furnish Humidifier Enable / Disable</w:t>
-      </w:r>
-    </w:p>
-    <w:p>
-      <w:pPr>
-        <w:pStyle w:val="PR2"/>
-        <w:numPr>
-          <w:ilvl w:val="4"/>
-          <w:numId w:val="6"/>
-        </w:numPr>
-        <w:spacing w:after="0"/>
-      </w:pPr>
-      <w:r>
-        <w:t xml:space="preserve">Furnish Humidifier Control Valve and Actuator </w:t>
-      </w:r>
-    </w:p>
-    <w:p>
-      <w:pPr>
-        <w:pStyle w:val="PR2"/>
-        <w:numPr>
-          <w:ilvl w:val="4"/>
-          <w:numId w:val="6"/>
-        </w:numPr>
-        <w:spacing w:after="0"/>
-      </w:pPr>
-      <w:r>
-        <w:t>Furnish and Install High Limit Humidity Switch</w:t>
-      </w:r>
-    </w:p>
-    <w:p>
-      <w:pPr>
-        <w:pStyle w:val="PR2"/>
-        <w:numPr>
-          <w:ilvl w:val="4"/>
-          <w:numId w:val="6"/>
-        </w:numPr>
-        <w:spacing w:after="0"/>
-      </w:pPr>
-      <w:r>
-        <w:t>Furnish and Install Leak Sensor</w:t>
-      </w:r>
-    </w:p>
-    <w:p>
-      <w:pPr>
-        <w:pStyle w:val="PR2"/>
-        <w:numPr>
-          <w:ilvl w:val="0"/>
-          <w:numId w:val="0"/>
-        </w:numPr>
-        <w:spacing w:after="0"/>
-        <w:ind w:left="1800"/>
-        <w:rPr>
-          <w:b/>
-          <w:bCs/>
-        </w:rPr>
-      </w:pPr>
-      <w:r>
-        <w:rPr>
-          <w:b/>
-          <w:bCs/>
-          <w:color w:val="ED7D31" w:themeColor="accent2"/>
-        </w:rPr>
-        <w:t>(**tech hour: 2 hour each hardware point)</w:t>
-      </w:r>
-    </w:p>
-    <w:p>
-      <w:pPr>
-        <w:pStyle w:val="PR2"/>
-        <w:numPr>
-          <w:ilvl w:val="0"/>
-          <w:numId w:val="0"/>
-        </w:numPr>
-        <w:tabs>
-          <w:tab w:val="left" w:pos="864"/>
-        </w:tabs>
-        <w:spacing w:after="0"/>
-        <w:ind w:left="1440"/>
-        <w:rPr>
-          <w:b/>
-        </w:rPr>
-      </w:pPr>
-    </w:p>
-    <w:p>
-      <w:pPr>
-        <w:pStyle w:val="PR2"/>
-        <w:tabs>
-          <w:tab w:val="num" w:pos="1440"/>
-        </w:tabs>
-        <w:spacing w:after="0"/>
-        <w:rPr>
-          <w:b/>
-          <w:sz w:val="24"/>
-          <w:highlight w:val="green"/>
-        </w:rPr>
-      </w:pPr>
-      <w:r>
-        <w:rPr>
-          <w:b/>
-          <w:sz w:val="24"/>
-          <w:highlight w:val="green"/>
-        </w:rPr>
-        <w:t xml:space="preserve">Qty (1) </w:t>
-      </w:r>
-      <w:r>
-        <w:rPr>
-          <w:b/>
-          <w:sz w:val="24"/>
-          <w:highlight w:val="green"/>
-        </w:rPr>
-        <w:t>Heat Exchanger System</w:t>
-      </w:r>
-      <w:r>
-        <w:rPr>
-          <w:b/>
-          <w:sz w:val="24"/>
-          <w:highlight w:val="green"/>
-        </w:rPr>
-        <w:t xml:space="preserve"> HX-2 | HWP-1, 2</w:t>
-      </w:r>
-    </w:p>
-    <w:p>
-      <w:pPr>
-        <w:pStyle w:val="PR2"/>
-        <w:numPr>
-          <w:ilvl w:val="4"/>
-          <w:numId w:val="6"/>
-        </w:numPr>
-        <w:spacing w:after="0"/>
-      </w:pPr>
-      <w:r>
-        <w:t xml:space="preserve">Furnish and Install DDC Controller </w:t>
-      </w:r>
-    </w:p>
-    <w:p>
-      <w:pPr>
-        <w:pStyle w:val="PR2"/>
-        <w:numPr>
-          <w:ilvl w:val="4"/>
-          <w:numId w:val="6"/>
-        </w:numPr>
-        <w:spacing w:after="0"/>
-      </w:pPr>
-      <w:r>
-        <w:t>Furnish and Install Outside Air Temperature / Humidity Sensor</w:t>
-      </w:r>
-    </w:p>
-    <w:p>
-      <w:pPr>
-        <w:pStyle w:val="PR2"/>
-        <w:numPr>
-          <w:ilvl w:val="4"/>
-          <w:numId w:val="6"/>
-        </w:numPr>
-        <w:spacing w:after="0"/>
-      </w:pPr>
-      <w:r>
-        <w:t xml:space="preserve">Furnish and Install System </w:t>
-      </w:r>
-      <w:r>
-        <w:t>###</w:t>
-      </w:r>
-      <w:r>
-        <w:t xml:space="preserve"> Water Supply / Return Temperature Sensor</w:t>
-      </w:r>
-    </w:p>
-    <w:p>
-      <w:pPr>
-        <w:pStyle w:val="PR2"/>
-        <w:numPr>
-          <w:ilvl w:val="4"/>
-          <w:numId w:val="6"/>
-        </w:numPr>
-        <w:spacing w:after="0"/>
-      </w:pPr>
-      <w:r>
-        <w:t xml:space="preserve">Furnish and Install Building </w:t>
-      </w:r>
-      <w:r>
-        <w:t>###</w:t>
-      </w:r>
-      <w:r>
-        <w:t xml:space="preserve"> Water Supply / Return Temperature Sensor</w:t>
-      </w:r>
-    </w:p>
-    <w:p>
-      <w:pPr>
-        <w:pStyle w:val="PR2"/>
-        <w:numPr>
-          <w:ilvl w:val="4"/>
-          <w:numId w:val="6"/>
-        </w:numPr>
-        <w:spacing w:after="0"/>
-      </w:pPr>
-      <w:r>
-        <w:t xml:space="preserve">Furnish and Install HX </w:t>
-      </w:r>
-      <w:r>
-        <w:t xml:space="preserve">Supply /Return </w:t>
-      </w:r>
-      <w:r>
-        <w:t>Water Temperature Sensor</w:t>
-      </w:r>
-    </w:p>
-    <w:p>
-      <w:pPr>
-        <w:pStyle w:val="PR2"/>
-        <w:numPr>
-          <w:ilvl w:val="4"/>
-          <w:numId w:val="6"/>
-        </w:numPr>
-        <w:spacing w:after="0"/>
-      </w:pPr>
-      <w:r>
-        <w:t>Furnish Pump Start/ Stop and Status</w:t>
-      </w:r>
-    </w:p>
-    <w:p>
-      <w:pPr>
-        <w:pStyle w:val="PR2"/>
-        <w:numPr>
-          <w:ilvl w:val="4"/>
-          <w:numId w:val="6"/>
-        </w:numPr>
-        <w:spacing w:after="0"/>
-      </w:pPr>
-      <w:r>
-        <w:t>Furnish Pump VFD Control</w:t>
-      </w:r>
-    </w:p>
-    <w:p>
-      <w:pPr>
-        <w:pStyle w:val="PR2"/>
-        <w:numPr>
-          <w:ilvl w:val="4"/>
-          <w:numId w:val="6"/>
-        </w:numPr>
-        <w:spacing w:after="0"/>
-      </w:pPr>
-      <w:r>
-        <w:t>Furnish and Install Differential Pressure Transmitter</w:t>
-      </w:r>
-    </w:p>
-    <w:p>
-      <w:pPr>
-        <w:pStyle w:val="PR2"/>
-        <w:numPr>
-          <w:ilvl w:val="4"/>
-          <w:numId w:val="6"/>
-        </w:numPr>
-        <w:spacing w:after="0"/>
-      </w:pPr>
-      <w:r>
-        <w:t>Furnish and Install Hot Water Flow Meter</w:t>
-      </w:r>
-    </w:p>
-    <w:p>
-      <w:pPr>
-        <w:pStyle w:val="PR2"/>
-        <w:numPr>
-          <w:ilvl w:val="4"/>
-          <w:numId w:val="6"/>
-        </w:numPr>
-        <w:spacing w:after="0"/>
-      </w:pPr>
-      <w:r>
-        <w:t>Furnish and Install Steam Flow Meter</w:t>
-      </w:r>
-    </w:p>
-    <w:p>
-      <w:pPr>
-        <w:pStyle w:val="PR2"/>
-        <w:numPr>
-          <w:ilvl w:val="4"/>
-          <w:numId w:val="6"/>
-        </w:numPr>
-        <w:spacing w:after="0"/>
-      </w:pPr>
-      <w:r>
-        <w:t xml:space="preserve">Furnish and Install BTU Meter – Flow Meter, Supply / Return Temperature Sensor </w:t>
-      </w:r>
-    </w:p>
-    <w:p>
-      <w:pPr>
-        <w:pStyle w:val="PR2"/>
-        <w:numPr>
-          <w:ilvl w:val="4"/>
-          <w:numId w:val="6"/>
-        </w:numPr>
-        <w:spacing w:after="0"/>
-      </w:pPr>
-      <w:r>
-        <w:t>Furnish and Wire ##” HX Steam Control Valve and Actuator</w:t>
-      </w:r>
-      <w:r>
-        <w:t xml:space="preserve"> (1/3</w:t>
-      </w:r>
-      <w:r>
-        <w:rPr>
-          <w:vertAlign w:val="superscript"/>
-        </w:rPr>
-        <w:t>rd</w:t>
-      </w:r>
-      <w:r>
-        <w:t>-2/3</w:t>
-      </w:r>
-      <w:r>
-        <w:rPr>
-          <w:vertAlign w:val="superscript"/>
-        </w:rPr>
-        <w:t>rd</w:t>
-      </w:r>
-      <w:r>
-        <w:t>)</w:t>
-      </w:r>
-    </w:p>
-    <w:p>
-      <w:pPr>
-        <w:pStyle w:val="PR2"/>
-        <w:numPr>
-          <w:ilvl w:val="4"/>
-          <w:numId w:val="6"/>
-        </w:numPr>
-        <w:spacing w:after="0"/>
-      </w:pPr>
-      <w:r>
-        <w:t xml:space="preserve">Furnish and Wire ##” HX </w:t>
-      </w:r>
-      <w:r>
-        <w:t xml:space="preserve">Primary Control </w:t>
-      </w:r>
-      <w:r>
-        <w:t>Valve and Actuator</w:t>
-      </w:r>
-    </w:p>
-    <w:p>
-      <w:pPr>
-        <w:pStyle w:val="PR2"/>
-        <w:numPr>
-          <w:ilvl w:val="4"/>
-          <w:numId w:val="6"/>
-        </w:numPr>
-        <w:spacing w:after="0"/>
-      </w:pPr>
-      <w:r>
-        <w:t xml:space="preserve">Furnish and Wire ##” HX </w:t>
-      </w:r>
-      <w:r>
-        <w:t xml:space="preserve">Secondary Control </w:t>
-      </w:r>
-      <w:r>
-        <w:t>Valve and Actuator</w:t>
-      </w:r>
-    </w:p>
-    <w:p>
-      <w:pPr>
-        <w:pStyle w:val="PR2"/>
-        <w:numPr>
-          <w:ilvl w:val="4"/>
-          <w:numId w:val="6"/>
-        </w:numPr>
-        <w:spacing w:after="0"/>
-      </w:pPr>
-      <w:r>
-        <w:t>Furnish and Wire ##” Differential Pressure Bypass Control Valve and Actuator</w:t>
-      </w:r>
-    </w:p>
-    <w:p>
-      <w:pPr>
-        <w:pStyle w:val="PR2"/>
-        <w:numPr>
-          <w:ilvl w:val="0"/>
-          <w:numId w:val="0"/>
-        </w:numPr>
-        <w:tabs>
-          <w:tab w:val="left" w:pos="864"/>
-        </w:tabs>
-        <w:spacing w:after="0"/>
-        <w:ind w:left="1440"/>
-        <w:rPr>
-          <w:b/>
-        </w:rPr>
-      </w:pPr>
-      <w:r>
-        <w:rPr>
-          <w:b/>
-          <w:bCs/>
-          <w:color w:val="ED7D31" w:themeColor="accent2"/>
-        </w:rPr>
-        <w:t>(**tech hour: 2 hour each hardware point)</w:t>
-      </w:r>
-    </w:p>
-    <w:p>
-      <w:pPr>
-        <w:pStyle w:val="PR2"/>
-        <w:tabs>
-          <w:tab w:val="num" w:pos="1440"/>
-        </w:tabs>
-        <w:spacing w:after="0"/>
-        <w:rPr>
-          <w:b/>
-          <w:sz w:val="24"/>
-        </w:rPr>
-      </w:pPr>
-      <w:r>
-        <w:rPr>
-          <w:b/>
-          <w:sz w:val="24"/>
-        </w:rPr>
-        <w:t xml:space="preserve">Qty (1) Heat Exchanger System HX-1 | </w:t>
-      </w:r>
-      <w:r>
-        <w:rPr>
-          <w:b/>
-          <w:sz w:val="24"/>
-        </w:rPr>
-        <w:t>Pump</w:t>
-      </w:r>
-      <w:r>
-        <w:rPr>
-          <w:b/>
-          <w:sz w:val="24"/>
-        </w:rPr>
-        <w:t>-1, 2</w:t>
-      </w:r>
-    </w:p>
-    <w:p>
-      <w:pPr>
-        <w:pStyle w:val="PR2"/>
-        <w:numPr>
-          <w:ilvl w:val="4"/>
-          <w:numId w:val="6"/>
-        </w:numPr>
-        <w:spacing w:after="0"/>
-      </w:pPr>
-      <w:r>
-        <w:t xml:space="preserve">Furnish and Install DDC Controller </w:t>
-      </w:r>
-    </w:p>
-    <w:p>
-      <w:pPr>
-        <w:pStyle w:val="PR2"/>
-        <w:numPr>
-          <w:ilvl w:val="4"/>
-          <w:numId w:val="6"/>
-        </w:numPr>
-        <w:spacing w:after="0"/>
-      </w:pPr>
-      <w:r>
-        <w:t xml:space="preserve">Furnish and Install System </w:t>
-      </w:r>
-      <w:r>
-        <w:t>###</w:t>
-      </w:r>
-      <w:r>
-        <w:t xml:space="preserve"> Water Supply / Return Temperature Sensor</w:t>
-      </w:r>
-    </w:p>
-    <w:p>
-      <w:pPr>
-        <w:pStyle w:val="PR2"/>
-        <w:numPr>
-          <w:ilvl w:val="4"/>
-          <w:numId w:val="6"/>
-        </w:numPr>
-        <w:spacing w:after="0"/>
-      </w:pPr>
-      <w:r>
-        <w:t xml:space="preserve">Furnish and Install Building </w:t>
-      </w:r>
-      <w:r>
-        <w:t>###</w:t>
-      </w:r>
-      <w:r>
-        <w:t xml:space="preserve"> Water Supply / Return Temperature Sensor</w:t>
-      </w:r>
-    </w:p>
-    <w:p>
-      <w:pPr>
-        <w:pStyle w:val="PR2"/>
-        <w:numPr>
-          <w:ilvl w:val="4"/>
-          <w:numId w:val="6"/>
-        </w:numPr>
-        <w:spacing w:after="0"/>
-      </w:pPr>
-      <w:r>
-        <w:t xml:space="preserve">Furnish and Install HX </w:t>
-      </w:r>
-      <w:r>
-        <w:t xml:space="preserve">Supply /Return </w:t>
-      </w:r>
-      <w:r>
-        <w:t>Water Temperature Sensor</w:t>
-      </w:r>
-    </w:p>
-    <w:p>
-      <w:pPr>
-        <w:pStyle w:val="PR2"/>
-        <w:numPr>
-          <w:ilvl w:val="4"/>
-          <w:numId w:val="6"/>
-        </w:numPr>
-        <w:spacing w:after="0"/>
-      </w:pPr>
-      <w:r>
-        <w:t>Furnish Pump Start/ Stop and Status</w:t>
-      </w:r>
-    </w:p>
-    <w:p>
-      <w:pPr>
-        <w:pStyle w:val="PR2"/>
-        <w:numPr>
-          <w:ilvl w:val="4"/>
-          <w:numId w:val="6"/>
-        </w:numPr>
-        <w:spacing w:after="0"/>
-      </w:pPr>
-      <w:r>
-        <w:t>Furnish Pump VFD Control</w:t>
-      </w:r>
-    </w:p>
-    <w:p>
-      <w:pPr>
-        <w:pStyle w:val="PR2"/>
-        <w:numPr>
-          <w:ilvl w:val="4"/>
-          <w:numId w:val="6"/>
-        </w:numPr>
-        <w:spacing w:after="0"/>
-      </w:pPr>
-      <w:r>
-        <w:t>Furnish and Install Differential Pressure Transmitter</w:t>
-      </w:r>
-    </w:p>
-    <w:p>
-      <w:pPr>
-        <w:pStyle w:val="PR2"/>
-        <w:numPr>
-          <w:ilvl w:val="4"/>
-          <w:numId w:val="6"/>
-        </w:numPr>
-        <w:spacing w:after="0"/>
-      </w:pPr>
-      <w:r>
-        <w:t>Furnish and Install Chilled Water Flow Meter</w:t>
-      </w:r>
-    </w:p>
-    <w:p>
-      <w:pPr>
-        <w:pStyle w:val="PR2"/>
-        <w:numPr>
-          <w:ilvl w:val="4"/>
-          <w:numId w:val="6"/>
-        </w:numPr>
-        <w:spacing w:after="0"/>
-      </w:pPr>
-      <w:r>
-        <w:t>Furnish and Install Steam Flow Meter</w:t>
-      </w:r>
-    </w:p>
-    <w:p>
-      <w:pPr>
-        <w:pStyle w:val="PR2"/>
-        <w:numPr>
-          <w:ilvl w:val="4"/>
-          <w:numId w:val="6"/>
-        </w:numPr>
-        <w:spacing w:after="0"/>
-      </w:pPr>
-      <w:r>
-        <w:t>Furnish and Wire ##” Heat Exchanger Control Valve and Actuator</w:t>
-      </w:r>
-    </w:p>
-    <w:p>
-      <w:pPr>
-        <w:pStyle w:val="PR2"/>
-        <w:numPr>
-          <w:ilvl w:val="4"/>
-          <w:numId w:val="6"/>
-        </w:numPr>
-        <w:spacing w:after="0"/>
-      </w:pPr>
-      <w:r>
-        <w:t>Furnish and Wire ##” Differential Pressure Bypass Control Valve and Actuator</w:t>
+        <w:t xml:space="preserve">Furnish and </w:t>
+      </w:r>
+      <w:proofErr w:type="gramStart"/>
+      <w:r>
+        <w:t>Wire</w:t>
+      </w:r>
+      <w:proofErr w:type="gramEnd"/>
+      <w:r>
+        <w:t xml:space="preserve"> ##” Heat Exchanger Control Valve and Actuator</w:t>
+      </w:r>
+    </w:p>
+    <w:p>
+      <w:pPr>
+        <w:pStyle w:val="PR2"/>
+        <w:numPr>
+          <w:ilvl w:val="4"/>
+          <w:numId w:val="6"/>
+        </w:numPr>
+        <w:spacing w:after="0"/>
+      </w:pPr>
+      <w:r>
+        <w:t xml:space="preserve">Furnish and </w:t>
+      </w:r>
+      <w:proofErr w:type="gramStart"/>
+      <w:r>
+        <w:t>Wire</w:t>
+      </w:r>
+      <w:proofErr w:type="gramEnd"/>
+      <w:r>
+        <w:t xml:space="preserve"> ##” Differential Pressure Bypass Control Valve and Actuator</w:t>
       </w:r>
     </w:p>
     <w:p>
@@ -7165,7 +7482,6 @@
           <w:b/>
           <w:sz w:val="24"/>
         </w:rPr>
-        <w:lastRenderedPageBreak/>
         <w:t>Chilled Water System</w:t>
       </w:r>
     </w:p>
@@ -7848,6 +8164,7 @@
           <w:b/>
           <w:sz w:val="24"/>
         </w:rPr>
+        <w:lastRenderedPageBreak/>
         <w:t>Qty (3) Glycol Water Pump GWP-2-1, 2, 3</w:t>
       </w:r>
     </w:p>
@@ -7952,7 +8269,6 @@
         <w:spacing w:after="0"/>
       </w:pPr>
       <w:r>
-        <w:lastRenderedPageBreak/>
         <w:t>Furnish and Install Chilled Glycol Heat Exchanger Temperature Transmitters (TT-07 thru 14) (Qty. 8 Total)</w:t>
       </w:r>
     </w:p>
@@ -8449,116 +8765,6 @@
       </w:r>
       <w:r>
         <w:t>Heat Exchanger Modulating Control Valves and Actuators (MCV-01 thru MCV-04) (Qty. 4 Total)</w:t>
-      </w:r>
-    </w:p>
-    <w:p>
-      <w:pPr>
-        <w:pStyle w:val="PR2"/>
-        <w:numPr>
-          <w:ilvl w:val="4"/>
-          <w:numId w:val="6"/>
-        </w:numPr>
-        <w:tabs>
-          <w:tab w:val="left" w:pos="864"/>
-        </w:tabs>
-        <w:spacing w:after="0"/>
-      </w:pPr>
-      <w:r>
-        <w:t xml:space="preserve">Furnish and Wire </w:t>
-      </w:r>
-      <w:r>
-        <w:rPr>
-          <w:b/>
-          <w:bCs/>
-        </w:rPr>
-        <w:t>6</w:t>
-      </w:r>
-      <w:r>
-        <w:rPr>
-          <w:b/>
-          <w:bCs/>
-        </w:rPr>
-        <w:t>”</w:t>
-      </w:r>
-      <w:r>
-        <w:rPr>
-          <w:b/>
-          <w:bCs/>
-        </w:rPr>
-        <w:t xml:space="preserve"> </w:t>
-      </w:r>
-      <w:r>
-        <w:t>Geothermal Heat Pump Modulating Control Valves and Actuators (MCV-05, MCV-06, MCV-07) (Qty. 3 Total)</w:t>
-      </w:r>
-    </w:p>
-    <w:p>
-      <w:pPr>
-        <w:pStyle w:val="PR2"/>
-        <w:numPr>
-          <w:ilvl w:val="4"/>
-          <w:numId w:val="6"/>
-        </w:numPr>
-        <w:tabs>
-          <w:tab w:val="left" w:pos="864"/>
-        </w:tabs>
-        <w:spacing w:after="0"/>
-      </w:pPr>
-      <w:r>
-        <w:t xml:space="preserve">Furnish and Wire </w:t>
-      </w:r>
-      <w:r>
-        <w:rPr>
-          <w:b/>
-          <w:bCs/>
-        </w:rPr>
-        <w:t>6”</w:t>
-      </w:r>
-      <w:r>
-        <w:t xml:space="preserve"> </w:t>
-      </w:r>
-      <w:r>
-        <w:t>Free Cooling Flow Control Modulating Control Valves and Actuators (Duty/Standby) (Qty. 2 Total) (MCV-08, 09)</w:t>
-      </w:r>
-    </w:p>
-    <w:p>
-      <w:pPr>
-        <w:pStyle w:val="PR2"/>
-        <w:numPr>
-          <w:ilvl w:val="4"/>
-          <w:numId w:val="6"/>
-        </w:numPr>
-        <w:tabs>
-          <w:tab w:val="left" w:pos="864"/>
-        </w:tabs>
-        <w:spacing w:after="0"/>
-      </w:pPr>
-      <w:r>
-        <w:t>Furnish and Wire</w:t>
-      </w:r>
-      <w:r>
-        <w:t xml:space="preserve"> </w:t>
-      </w:r>
-      <w:r>
-        <w:rPr>
-          <w:b/>
-          <w:bCs/>
-        </w:rPr>
-        <w:t>##”</w:t>
-      </w:r>
-      <w:r>
-        <w:t xml:space="preserve"> </w:t>
-      </w:r>
-      <w:r>
-        <w:t xml:space="preserve">Chilled Glycol Flow Bypass Control Valve and Actuator (Qty. 1) </w:t>
-      </w:r>
-      <w:r>
-        <w:rPr>
-          <w:rFonts w:ascii="Segoe UI Emoji" w:hAnsi="Segoe UI Emoji" w:cs="Segoe UI Emoji"/>
-        </w:rPr>
-        <w:t>(</w:t>
-      </w:r>
-      <w:r>
-        <w:t>BPY-02)</w:t>
       </w:r>
     </w:p>
     <w:p>
@@ -8582,6 +8788,129 @@
           <w:b/>
           <w:bCs/>
         </w:rPr>
+        <w:t>6</w:t>
+      </w:r>
+      <w:r>
+        <w:rPr>
+          <w:b/>
+          <w:bCs/>
+        </w:rPr>
+        <w:t>”</w:t>
+      </w:r>
+      <w:r>
+        <w:rPr>
+          <w:b/>
+          <w:bCs/>
+        </w:rPr>
+        <w:t xml:space="preserve"> </w:t>
+      </w:r>
+      <w:r>
+        <w:t>Geothermal Heat Pump Modulating Control Valves and Actuators (MCV-05, MCV-06, MCV-07) (Qty. 3 Total)</w:t>
+      </w:r>
+    </w:p>
+    <w:p>
+      <w:pPr>
+        <w:pStyle w:val="PR2"/>
+        <w:numPr>
+          <w:ilvl w:val="4"/>
+          <w:numId w:val="6"/>
+        </w:numPr>
+        <w:tabs>
+          <w:tab w:val="left" w:pos="864"/>
+        </w:tabs>
+        <w:spacing w:after="0"/>
+      </w:pPr>
+      <w:r>
+        <w:t xml:space="preserve">Furnish and Wire </w:t>
+      </w:r>
+      <w:r>
+        <w:rPr>
+          <w:b/>
+          <w:bCs/>
+        </w:rPr>
+        <w:t>6”</w:t>
+      </w:r>
+      <w:r>
+        <w:t xml:space="preserve"> </w:t>
+      </w:r>
+      <w:r>
+        <w:t>Free Cooling Flow Control Modulating Control Valves and Actuators (Duty/Standby) (Qty. 2 Total) (MCV-08, 09)</w:t>
+      </w:r>
+    </w:p>
+    <w:p>
+      <w:pPr>
+        <w:pStyle w:val="PR2"/>
+        <w:numPr>
+          <w:ilvl w:val="4"/>
+          <w:numId w:val="6"/>
+        </w:numPr>
+        <w:tabs>
+          <w:tab w:val="left" w:pos="864"/>
+        </w:tabs>
+        <w:spacing w:after="0"/>
+      </w:pPr>
+      <w:r>
+        <w:t xml:space="preserve">Furnish and </w:t>
+      </w:r>
+      <w:proofErr w:type="gramStart"/>
+      <w:r>
+        <w:t>Wire</w:t>
+      </w:r>
+      <w:proofErr w:type="gramEnd"/>
+      <w:r>
+        <w:t xml:space="preserve"> </w:t>
+      </w:r>
+      <w:r>
+        <w:rPr>
+          <w:b/>
+          <w:bCs/>
+        </w:rPr>
+        <w:t>##”</w:t>
+      </w:r>
+      <w:r>
+        <w:t xml:space="preserve"> </w:t>
+      </w:r>
+      <w:r>
+        <w:t xml:space="preserve">Chilled Glycol Flow Bypass Control Valve and Actuator (Qty. 1) </w:t>
+      </w:r>
+      <w:r>
+        <w:rPr>
+          <w:rFonts w:ascii="Segoe UI Emoji" w:hAnsi="Segoe UI Emoji" w:cs="Segoe UI Emoji"/>
+        </w:rPr>
+        <w:t>(</w:t>
+      </w:r>
+      <w:r>
+        <w:t>BPY-02)</w:t>
+      </w:r>
+    </w:p>
+    <w:p>
+      <w:pPr>
+        <w:pStyle w:val="PR2"/>
+        <w:numPr>
+          <w:ilvl w:val="4"/>
+          <w:numId w:val="6"/>
+        </w:numPr>
+        <w:tabs>
+          <w:tab w:val="left" w:pos="864"/>
+        </w:tabs>
+        <w:spacing w:after="0"/>
+      </w:pPr>
+      <w:r>
+        <w:t xml:space="preserve">Furnish and </w:t>
+      </w:r>
+      <w:proofErr w:type="gramStart"/>
+      <w:r>
+        <w:t>Wire</w:t>
+      </w:r>
+      <w:proofErr w:type="gramEnd"/>
+      <w:r>
+        <w:t xml:space="preserve"> </w:t>
+      </w:r>
+      <w:r>
+        <w:rPr>
+          <w:b/>
+          <w:bCs/>
+        </w:rPr>
         <w:t>##”</w:t>
       </w:r>
       <w:r>
@@ -8892,14 +9221,32 @@
           <w:bCs/>
           <w:color w:val="ED7D31" w:themeColor="accent2"/>
         </w:rPr>
-        <w:t xml:space="preserve"> hour </w:t>
-      </w:r>
+        <w:t xml:space="preserve"> </w:t>
+      </w:r>
+      <w:proofErr w:type="gramStart"/>
       <w:r>
         <w:rPr>
           <w:b/>
           <w:bCs/>
           <w:color w:val="ED7D31" w:themeColor="accent2"/>
         </w:rPr>
+        <w:t>hour</w:t>
+      </w:r>
+      <w:proofErr w:type="gramEnd"/>
+      <w:r>
+        <w:rPr>
+          <w:b/>
+          <w:bCs/>
+          <w:color w:val="ED7D31" w:themeColor="accent2"/>
+        </w:rPr>
+        <w:t xml:space="preserve"> </w:t>
+      </w:r>
+      <w:r>
+        <w:rPr>
+          <w:b/>
+          <w:bCs/>
+          <w:color w:val="ED7D31" w:themeColor="accent2"/>
+        </w:rPr>
         <w:t>per panel</w:t>
       </w:r>
       <w:r>
@@ -9135,6 +9482,7 @@
         <w:spacing w:after="0"/>
       </w:pPr>
       <w:r>
+        <w:lastRenderedPageBreak/>
         <w:t>Tie in Mfr. Tower Vibration Switch</w:t>
       </w:r>
     </w:p>
@@ -9246,7 +9594,6 @@
         <w:spacing w:after="0"/>
       </w:pPr>
       <w:r>
-        <w:lastRenderedPageBreak/>
         <w:t>Map Available Points Via Mfr. Provided BMS Interface</w:t>
       </w:r>
     </w:p>
@@ -9383,14 +9730,32 @@
           <w:bCs/>
           <w:color w:val="ED7D31" w:themeColor="accent2"/>
         </w:rPr>
-        <w:t xml:space="preserve">(**tech hour: 2 hour </w:t>
-      </w:r>
+        <w:t xml:space="preserve">(**tech hour: 2 </w:t>
+      </w:r>
+      <w:proofErr w:type="gramStart"/>
       <w:r>
         <w:rPr>
           <w:b/>
           <w:bCs/>
           <w:color w:val="ED7D31" w:themeColor="accent2"/>
         </w:rPr>
+        <w:t>hour</w:t>
+      </w:r>
+      <w:proofErr w:type="gramEnd"/>
+      <w:r>
+        <w:rPr>
+          <w:b/>
+          <w:bCs/>
+          <w:color w:val="ED7D31" w:themeColor="accent2"/>
+        </w:rPr>
+        <w:t xml:space="preserve"> </w:t>
+      </w:r>
+      <w:r>
+        <w:rPr>
+          <w:b/>
+          <w:bCs/>
+          <w:color w:val="ED7D31" w:themeColor="accent2"/>
+        </w:rPr>
         <w:t>per each unit</w:t>
       </w:r>
       <w:r>
@@ -9496,14 +9861,32 @@
           <w:bCs/>
           <w:color w:val="ED7D31" w:themeColor="accent2"/>
         </w:rPr>
-        <w:t xml:space="preserve">(**tech hour: 2 hour </w:t>
-      </w:r>
+        <w:t xml:space="preserve">(**tech hour: 2 </w:t>
+      </w:r>
+      <w:proofErr w:type="gramStart"/>
       <w:r>
         <w:rPr>
           <w:b/>
           <w:bCs/>
           <w:color w:val="ED7D31" w:themeColor="accent2"/>
         </w:rPr>
+        <w:t>hour</w:t>
+      </w:r>
+      <w:proofErr w:type="gramEnd"/>
+      <w:r>
+        <w:rPr>
+          <w:b/>
+          <w:bCs/>
+          <w:color w:val="ED7D31" w:themeColor="accent2"/>
+        </w:rPr>
+        <w:t xml:space="preserve"> </w:t>
+      </w:r>
+      <w:r>
+        <w:rPr>
+          <w:b/>
+          <w:bCs/>
+          <w:color w:val="ED7D31" w:themeColor="accent2"/>
+        </w:rPr>
         <w:t>per each unit</w:t>
       </w:r>
       <w:r>
@@ -9648,7 +10031,25 @@
           <w:bCs/>
           <w:color w:val="ED7D31" w:themeColor="accent2"/>
         </w:rPr>
-        <w:t xml:space="preserve">(**tech hour: 2 hour </w:t>
+        <w:t xml:space="preserve">(**tech hour: 2 </w:t>
+      </w:r>
+      <w:proofErr w:type="gramStart"/>
+      <w:r>
+        <w:rPr>
+          <w:b/>
+          <w:bCs/>
+          <w:color w:val="ED7D31" w:themeColor="accent2"/>
+        </w:rPr>
+        <w:t>hour</w:t>
+      </w:r>
+      <w:proofErr w:type="gramEnd"/>
+      <w:r>
+        <w:rPr>
+          <w:b/>
+          <w:bCs/>
+          <w:color w:val="ED7D31" w:themeColor="accent2"/>
+        </w:rPr>
+        <w:t xml:space="preserve"> </w:t>
       </w:r>
       <w:r>
         <w:rPr>
@@ -9782,7 +10183,25 @@
           <w:bCs/>
           <w:color w:val="ED7D31" w:themeColor="accent2"/>
         </w:rPr>
-        <w:t xml:space="preserve">(**tech hour: 2 hour </w:t>
+        <w:t xml:space="preserve">(**tech hour: 2 </w:t>
+      </w:r>
+      <w:proofErr w:type="gramStart"/>
+      <w:r>
+        <w:rPr>
+          <w:b/>
+          <w:bCs/>
+          <w:color w:val="ED7D31" w:themeColor="accent2"/>
+        </w:rPr>
+        <w:t>hour</w:t>
+      </w:r>
+      <w:proofErr w:type="gramEnd"/>
+      <w:r>
+        <w:rPr>
+          <w:b/>
+          <w:bCs/>
+          <w:color w:val="ED7D31" w:themeColor="accent2"/>
+        </w:rPr>
+        <w:t xml:space="preserve"> </w:t>
       </w:r>
       <w:r>
         <w:rPr>
@@ -9878,7 +10297,25 @@
           <w:bCs/>
           <w:color w:val="ED7D31" w:themeColor="accent2"/>
         </w:rPr>
-        <w:t xml:space="preserve">(**tech hour: 2 hour </w:t>
+        <w:t xml:space="preserve">(**tech hour: 2 </w:t>
+      </w:r>
+      <w:proofErr w:type="gramStart"/>
+      <w:r>
+        <w:rPr>
+          <w:b/>
+          <w:bCs/>
+          <w:color w:val="ED7D31" w:themeColor="accent2"/>
+        </w:rPr>
+        <w:t>hour</w:t>
+      </w:r>
+      <w:proofErr w:type="gramEnd"/>
+      <w:r>
+        <w:rPr>
+          <w:b/>
+          <w:bCs/>
+          <w:color w:val="ED7D31" w:themeColor="accent2"/>
+        </w:rPr>
+        <w:t xml:space="preserve"> </w:t>
       </w:r>
       <w:r>
         <w:rPr>
@@ -10008,7 +10445,6 @@
         <w:spacing w:after="0"/>
       </w:pPr>
       <w:r>
-        <w:lastRenderedPageBreak/>
         <w:t>Furnish Fan Start / Stop and Status</w:t>
       </w:r>
     </w:p>
@@ -10130,7 +10566,25 @@
           <w:bCs/>
           <w:color w:val="ED7D31" w:themeColor="accent2"/>
         </w:rPr>
-        <w:t xml:space="preserve"> hour </w:t>
+        <w:t xml:space="preserve"> </w:t>
+      </w:r>
+      <w:proofErr w:type="gramStart"/>
+      <w:r>
+        <w:rPr>
+          <w:b/>
+          <w:bCs/>
+          <w:color w:val="ED7D31" w:themeColor="accent2"/>
+        </w:rPr>
+        <w:t>hour</w:t>
+      </w:r>
+      <w:proofErr w:type="gramEnd"/>
+      <w:r>
+        <w:rPr>
+          <w:b/>
+          <w:bCs/>
+          <w:color w:val="ED7D31" w:themeColor="accent2"/>
+        </w:rPr>
+        <w:t xml:space="preserve"> </w:t>
       </w:r>
       <w:r>
         <w:rPr>
@@ -10449,7 +10903,25 @@
           <w:bCs/>
           <w:color w:val="ED7D31" w:themeColor="accent2"/>
         </w:rPr>
-        <w:t xml:space="preserve"> hour </w:t>
+        <w:t xml:space="preserve"> </w:t>
+      </w:r>
+      <w:proofErr w:type="gramStart"/>
+      <w:r>
+        <w:rPr>
+          <w:b/>
+          <w:bCs/>
+          <w:color w:val="ED7D31" w:themeColor="accent2"/>
+        </w:rPr>
+        <w:t>hour</w:t>
+      </w:r>
+      <w:proofErr w:type="gramEnd"/>
+      <w:r>
+        <w:rPr>
+          <w:b/>
+          <w:bCs/>
+          <w:color w:val="ED7D31" w:themeColor="accent2"/>
+        </w:rPr>
+        <w:t xml:space="preserve"> </w:t>
       </w:r>
       <w:r>
         <w:rPr>
@@ -10634,6 +11106,7 @@
         <w:spacing w:after="0"/>
       </w:pPr>
       <w:r>
+        <w:lastRenderedPageBreak/>
         <w:t xml:space="preserve">Furnish and Install Damper Actuator w/ End Switch </w:t>
       </w:r>
     </w:p>
@@ -10706,14 +11179,32 @@
           <w:bCs/>
           <w:color w:val="ED7D31" w:themeColor="accent2"/>
         </w:rPr>
-        <w:t xml:space="preserve"> hour </w:t>
-      </w:r>
+        <w:t xml:space="preserve"> </w:t>
+      </w:r>
+      <w:proofErr w:type="gramStart"/>
       <w:r>
         <w:rPr>
           <w:b/>
           <w:bCs/>
           <w:color w:val="ED7D31" w:themeColor="accent2"/>
         </w:rPr>
+        <w:t>hour</w:t>
+      </w:r>
+      <w:proofErr w:type="gramEnd"/>
+      <w:r>
+        <w:rPr>
+          <w:b/>
+          <w:bCs/>
+          <w:color w:val="ED7D31" w:themeColor="accent2"/>
+        </w:rPr>
+        <w:t xml:space="preserve"> </w:t>
+      </w:r>
+      <w:r>
+        <w:rPr>
+          <w:b/>
+          <w:bCs/>
+          <w:color w:val="ED7D31" w:themeColor="accent2"/>
+        </w:rPr>
         <w:t>per each unit</w:t>
       </w:r>
       <w:r>
@@ -10781,7 +11272,6 @@
         <w:spacing w:after="0"/>
       </w:pPr>
       <w:r>
-        <w:lastRenderedPageBreak/>
         <w:t>Map Available Points Via Mfr. Provided BMS Interface</w:t>
       </w:r>
     </w:p>
@@ -10817,7 +11307,25 @@
           <w:bCs/>
           <w:color w:val="ED7D31" w:themeColor="accent2"/>
         </w:rPr>
-        <w:t xml:space="preserve"> hour </w:t>
+        <w:t xml:space="preserve"> </w:t>
+      </w:r>
+      <w:proofErr w:type="gramStart"/>
+      <w:r>
+        <w:rPr>
+          <w:b/>
+          <w:bCs/>
+          <w:color w:val="ED7D31" w:themeColor="accent2"/>
+        </w:rPr>
+        <w:t>hour</w:t>
+      </w:r>
+      <w:proofErr w:type="gramEnd"/>
+      <w:r>
+        <w:rPr>
+          <w:b/>
+          <w:bCs/>
+          <w:color w:val="ED7D31" w:themeColor="accent2"/>
+        </w:rPr>
+        <w:t xml:space="preserve"> </w:t>
       </w:r>
       <w:r>
         <w:rPr>
@@ -11299,6 +11807,7 @@
         <w:spacing w:after="0" w:line="254" w:lineRule="auto"/>
       </w:pPr>
       <w:r>
+        <w:lastRenderedPageBreak/>
         <w:t xml:space="preserve">Building Domestic Water Meter </w:t>
       </w:r>
     </w:p>
@@ -12027,6 +12536,7 @@
         <w:spacing w:after="0"/>
       </w:pPr>
       <w:r>
+        <w:lastRenderedPageBreak/>
         <w:t xml:space="preserve">Furnish and Install BTU Meter – Flow Meter, Supply / Return Temperature Sensor </w:t>
       </w:r>
     </w:p>
@@ -12108,7 +12618,6 @@
         <w:spacing w:after="0"/>
       </w:pPr>
       <w:r>
-        <w:lastRenderedPageBreak/>
         <w:t>Map Available Points Via Mfr. Provided BMS Interface</w:t>
       </w:r>
     </w:p>
@@ -12159,7 +12668,25 @@
           <w:bCs/>
           <w:color w:val="ED7D31" w:themeColor="accent2"/>
         </w:rPr>
-        <w:t>2 hour per hardwired point)</w:t>
+        <w:t xml:space="preserve">2 </w:t>
+      </w:r>
+      <w:proofErr w:type="gramStart"/>
+      <w:r>
+        <w:rPr>
+          <w:b/>
+          <w:bCs/>
+          <w:color w:val="ED7D31" w:themeColor="accent2"/>
+        </w:rPr>
+        <w:t>hour</w:t>
+      </w:r>
+      <w:proofErr w:type="gramEnd"/>
+      <w:r>
+        <w:rPr>
+          <w:b/>
+          <w:bCs/>
+          <w:color w:val="ED7D31" w:themeColor="accent2"/>
+        </w:rPr>
+        <w:t xml:space="preserve"> per hardwired point)</w:t>
       </w:r>
     </w:p>
     <w:p>
@@ -12644,6 +13171,7 @@
         <w:spacing w:after="0"/>
       </w:pPr>
       <w:r>
+        <w:lastRenderedPageBreak/>
         <w:t>Furnish and Install GHP Differential Pressure Sensors (DP-09, DP-10, DP-11) (Qty. 3 Total)</w:t>
       </w:r>
     </w:p>
@@ -12762,7 +13290,6 @@
         <w:spacing w:after="0"/>
       </w:pPr>
       <w:r>
-        <w:lastRenderedPageBreak/>
         <w:t>Furnish Pump VFD Common Alarm (Qty. 5 Total)</w:t>
       </w:r>
     </w:p>
@@ -12949,7 +13476,25 @@
           <w:bCs/>
           <w:color w:val="ED7D31" w:themeColor="accent2"/>
         </w:rPr>
-        <w:t>2 hour per hardwired point)</w:t>
+        <w:t xml:space="preserve">2 </w:t>
+      </w:r>
+      <w:proofErr w:type="gramStart"/>
+      <w:r>
+        <w:rPr>
+          <w:b/>
+          <w:bCs/>
+          <w:color w:val="ED7D31" w:themeColor="accent2"/>
+        </w:rPr>
+        <w:t>hour</w:t>
+      </w:r>
+      <w:proofErr w:type="gramEnd"/>
+      <w:r>
+        <w:rPr>
+          <w:b/>
+          <w:bCs/>
+          <w:color w:val="ED7D31" w:themeColor="accent2"/>
+        </w:rPr>
+        <w:t xml:space="preserve"> per hardwired point)</w:t>
       </w:r>
     </w:p>
     <w:p>
@@ -13432,7 +13977,25 @@
           <w:bCs/>
           <w:color w:val="ED7D31" w:themeColor="accent2"/>
         </w:rPr>
-        <w:t>2 hour per indoor unit)</w:t>
+        <w:t xml:space="preserve">2 </w:t>
+      </w:r>
+      <w:proofErr w:type="gramStart"/>
+      <w:r>
+        <w:rPr>
+          <w:b/>
+          <w:bCs/>
+          <w:color w:val="ED7D31" w:themeColor="accent2"/>
+        </w:rPr>
+        <w:t>hour</w:t>
+      </w:r>
+      <w:proofErr w:type="gramEnd"/>
+      <w:r>
+        <w:rPr>
+          <w:b/>
+          <w:bCs/>
+          <w:color w:val="ED7D31" w:themeColor="accent2"/>
+        </w:rPr>
+        <w:t xml:space="preserve"> per indoor unit)</w:t>
       </w:r>
     </w:p>
     <w:p>
@@ -13513,6 +14076,7 @@
         <w:spacing w:after="0"/>
       </w:pPr>
       <w:r>
+        <w:lastRenderedPageBreak/>
         <w:t>Install and</w:t>
       </w:r>
       <w:r>
@@ -13611,7 +14175,6 @@
         <w:spacing w:after="0"/>
       </w:pPr>
       <w:r>
-        <w:lastRenderedPageBreak/>
         <w:t>Furnish BMS Communication Wiring to Factory Controls</w:t>
       </w:r>
     </w:p>
@@ -13676,7 +14239,25 @@
           <w:bCs/>
           <w:color w:val="ED7D31" w:themeColor="accent2"/>
         </w:rPr>
-        <w:t>2 hour per indoor unit)</w:t>
+        <w:t xml:space="preserve">2 </w:t>
+      </w:r>
+      <w:proofErr w:type="gramStart"/>
+      <w:r>
+        <w:rPr>
+          <w:b/>
+          <w:bCs/>
+          <w:color w:val="ED7D31" w:themeColor="accent2"/>
+        </w:rPr>
+        <w:t>hour</w:t>
+      </w:r>
+      <w:proofErr w:type="gramEnd"/>
+      <w:r>
+        <w:rPr>
+          <w:b/>
+          <w:bCs/>
+          <w:color w:val="ED7D31" w:themeColor="accent2"/>
+        </w:rPr>
+        <w:t xml:space="preserve"> per indoor unit)</w:t>
       </w:r>
     </w:p>
     <w:p>
@@ -13919,7 +14500,25 @@
           <w:bCs/>
           <w:color w:val="ED7D31" w:themeColor="accent2"/>
         </w:rPr>
-        <w:t>4 hour per indoor unit)</w:t>
+        <w:t xml:space="preserve">4 </w:t>
+      </w:r>
+      <w:proofErr w:type="gramStart"/>
+      <w:r>
+        <w:rPr>
+          <w:b/>
+          <w:bCs/>
+          <w:color w:val="ED7D31" w:themeColor="accent2"/>
+        </w:rPr>
+        <w:t>hour</w:t>
+      </w:r>
+      <w:proofErr w:type="gramEnd"/>
+      <w:r>
+        <w:rPr>
+          <w:b/>
+          <w:bCs/>
+          <w:color w:val="ED7D31" w:themeColor="accent2"/>
+        </w:rPr>
+        <w:t xml:space="preserve"> per indoor unit)</w:t>
       </w:r>
     </w:p>
     <w:p>
@@ -14329,6 +14928,7 @@
           <w:rFonts w:ascii="Calibri" w:eastAsia="Calibri" w:hAnsi="Calibri" w:cs="Times New Roman"/>
           <w:color w:val="E36C0A"/>
         </w:rPr>
+        <w:lastRenderedPageBreak/>
         <w:t xml:space="preserve">Get quote from </w:t>
       </w:r>
       <w:hyperlink r:id="rId8" w:tgtFrame="_blank" w:tooltip="mailto:mark.mcdade@inncom.com" w:history="1">
@@ -14495,7 +15095,6 @@
           <w:rFonts w:ascii="Calibri" w:eastAsia="Calibri" w:hAnsi="Calibri" w:cs="Times New Roman"/>
           <w:color w:val="E36C0A"/>
         </w:rPr>
-        <w:lastRenderedPageBreak/>
         <w:t>Tie-in Ionization Device Alarm</w:t>
       </w:r>
     </w:p>

</xml_diff>